<commit_message>
settings screen + 5 color themes
</commit_message>
<xml_diff>
--- a/Docks/Prompts.docx
+++ b/Docks/Prompts.docx
@@ -27,9 +27,20 @@
           <w:lang w:eastAsia="de-DE"/>
           <w14:ligatures w14:val="none"/>
         </w:rPr>
-        <w:t xml:space="preserve">KI-Einsatz &amp; Prompt-Dokumentation: </w:t>
-      </w:r>
-      <w:proofErr w:type="spellStart"/>
+        <w:t>KI-Einsatz &amp; Prompt-Dokumentation: IronLog</w:t>
+      </w:r>
+    </w:p>
+    <w:p>
+      <w:pPr>
+        <w:spacing w:after="100" w:afterAutospacing="1"/>
+        <w:rPr>
+          <w:rFonts w:ascii="Arial" w:eastAsia="Times New Roman" w:hAnsi="Arial" w:cs="Arial"/>
+          <w:color w:val="000000"/>
+          <w:kern w:val="0"/>
+          <w:lang w:eastAsia="de-DE"/>
+          <w14:ligatures w14:val="none"/>
+        </w:rPr>
+      </w:pPr>
       <w:r>
         <w:rPr>
           <w:rFonts w:ascii="Arial" w:eastAsia="Times New Roman" w:hAnsi="Arial" w:cs="Arial"/>
@@ -37,14 +48,31 @@
           <w:bCs/>
           <w:color w:val="000000"/>
           <w:kern w:val="0"/>
-          <w:sz w:val="40"/>
-          <w:szCs w:val="40"/>
-          <w:lang w:eastAsia="de-DE"/>
-          <w14:ligatures w14:val="none"/>
-        </w:rPr>
-        <w:t>IronLog</w:t>
-      </w:r>
-      <w:proofErr w:type="spellEnd"/>
+          <w:lang w:eastAsia="de-DE"/>
+          <w14:ligatures w14:val="none"/>
+        </w:rPr>
+        <w:t>Projekt:</w:t>
+      </w:r>
+      <w:r>
+        <w:rPr>
+          <w:rFonts w:ascii="Arial" w:eastAsia="Times New Roman" w:hAnsi="Arial" w:cs="Arial"/>
+          <w:color w:val="000000"/>
+          <w:kern w:val="0"/>
+          <w:lang w:eastAsia="de-DE"/>
+          <w14:ligatures w14:val="none"/>
+        </w:rPr>
+        <w:t xml:space="preserve"> </w:t>
+      </w:r>
+      <w:r>
+        <w:rPr>
+          <w:rFonts w:ascii="Arial" w:eastAsia="Times New Roman" w:hAnsi="Arial" w:cs="Arial"/>
+          <w:color w:val="000000"/>
+          <w:kern w:val="0"/>
+          <w:lang w:eastAsia="de-DE"/>
+          <w14:ligatures w14:val="none"/>
+        </w:rPr>
+        <w:t>IronLog – Minimalist Gym Tracker</w:t>
+      </w:r>
     </w:p>
     <w:p>
       <w:pPr>
@@ -67,7 +95,7 @@
           <w:lang w:eastAsia="de-DE"/>
           <w14:ligatures w14:val="none"/>
         </w:rPr>
-        <w:t>Projekt:</w:t>
+        <w:t>KI-Modell:</w:t>
       </w:r>
       <w:r>
         <w:rPr>
@@ -79,49 +107,15 @@
         </w:rPr>
         <w:t xml:space="preserve"> </w:t>
       </w:r>
-      <w:proofErr w:type="spellStart"/>
-      <w:r>
-        <w:rPr>
-          <w:rFonts w:ascii="Arial" w:eastAsia="Times New Roman" w:hAnsi="Arial" w:cs="Arial"/>
-          <w:color w:val="000000"/>
-          <w:kern w:val="0"/>
-          <w:lang w:eastAsia="de-DE"/>
-          <w14:ligatures w14:val="none"/>
-        </w:rPr>
-        <w:t>IronLog</w:t>
-      </w:r>
-      <w:proofErr w:type="spellEnd"/>
-      <w:r>
-        <w:rPr>
-          <w:rFonts w:ascii="Arial" w:eastAsia="Times New Roman" w:hAnsi="Arial" w:cs="Arial"/>
-          <w:color w:val="000000"/>
-          <w:kern w:val="0"/>
-          <w:lang w:eastAsia="de-DE"/>
-          <w14:ligatures w14:val="none"/>
-        </w:rPr>
-        <w:t xml:space="preserve"> – Minimalist </w:t>
-      </w:r>
-      <w:proofErr w:type="spellStart"/>
-      <w:r>
-        <w:rPr>
-          <w:rFonts w:ascii="Arial" w:eastAsia="Times New Roman" w:hAnsi="Arial" w:cs="Arial"/>
-          <w:color w:val="000000"/>
-          <w:kern w:val="0"/>
-          <w:lang w:eastAsia="de-DE"/>
-          <w14:ligatures w14:val="none"/>
-        </w:rPr>
-        <w:t>Gym</w:t>
-      </w:r>
-      <w:proofErr w:type="spellEnd"/>
-      <w:r>
-        <w:rPr>
-          <w:rFonts w:ascii="Arial" w:eastAsia="Times New Roman" w:hAnsi="Arial" w:cs="Arial"/>
-          <w:color w:val="000000"/>
-          <w:kern w:val="0"/>
-          <w:lang w:eastAsia="de-DE"/>
-          <w14:ligatures w14:val="none"/>
-        </w:rPr>
-        <w:t xml:space="preserve"> Tracker</w:t>
+      <w:r>
+        <w:rPr>
+          <w:rFonts w:ascii="Arial" w:eastAsia="Times New Roman" w:hAnsi="Arial" w:cs="Arial"/>
+          <w:color w:val="000000"/>
+          <w:kern w:val="0"/>
+          <w:lang w:eastAsia="de-DE"/>
+          <w14:ligatures w14:val="none"/>
+        </w:rPr>
+        <w:t>Google Gemini (Modellversion 3.1 Pro)</w:t>
       </w:r>
     </w:p>
     <w:p>
@@ -145,7 +139,7 @@
           <w:lang w:eastAsia="de-DE"/>
           <w14:ligatures w14:val="none"/>
         </w:rPr>
-        <w:t>KI-Modell:</w:t>
+        <w:t>Rolle der KI:</w:t>
       </w:r>
       <w:r>
         <w:rPr>
@@ -165,7 +159,7 @@
           <w:lang w:eastAsia="de-DE"/>
           <w14:ligatures w14:val="none"/>
         </w:rPr>
-        <w:t>Google Gemini (Modellversion 3.1 Pro)</w:t>
+        <w:t>Coding Partner</w:t>
       </w:r>
     </w:p>
     <w:p>
@@ -189,7 +183,7 @@
           <w:lang w:eastAsia="de-DE"/>
           <w14:ligatures w14:val="none"/>
         </w:rPr>
-        <w:t>Rolle der KI:</w:t>
+        <w:t>Zeitraum:</w:t>
       </w:r>
       <w:r>
         <w:rPr>
@@ -209,148 +203,60 @@
           <w:lang w:eastAsia="de-DE"/>
           <w14:ligatures w14:val="none"/>
         </w:rPr>
-        <w:t>Coding Partner</w:t>
+        <w:t>Woche 2 &amp; Woche 3 (Backend-Entwicklung, Refactoring &amp; Frontend-Basis)</w:t>
       </w:r>
     </w:p>
     <w:p>
       <w:pPr>
         <w:spacing w:after="100" w:afterAutospacing="1"/>
-        <w:rPr>
-          <w:rFonts w:ascii="Arial" w:eastAsia="Times New Roman" w:hAnsi="Arial" w:cs="Arial"/>
-          <w:color w:val="000000"/>
-          <w:kern w:val="0"/>
-          <w:lang w:eastAsia="de-DE"/>
-          <w14:ligatures w14:val="none"/>
-        </w:rPr>
-      </w:pPr>
-      <w:r>
+        <w:outlineLvl w:val="2"/>
         <w:rPr>
           <w:rFonts w:ascii="Arial" w:eastAsia="Times New Roman" w:hAnsi="Arial" w:cs="Arial"/>
           <w:b/>
           <w:bCs/>
           <w:color w:val="000000"/>
           <w:kern w:val="0"/>
-          <w:lang w:eastAsia="de-DE"/>
-          <w14:ligatures w14:val="none"/>
-        </w:rPr>
-        <w:t>Zeitraum:</w:t>
-      </w:r>
-      <w:r>
-        <w:rPr>
-          <w:rFonts w:ascii="Arial" w:eastAsia="Times New Roman" w:hAnsi="Arial" w:cs="Arial"/>
-          <w:color w:val="000000"/>
-          <w:kern w:val="0"/>
-          <w:lang w:eastAsia="de-DE"/>
-          <w14:ligatures w14:val="none"/>
-        </w:rPr>
-        <w:t xml:space="preserve"> </w:t>
-      </w:r>
-      <w:r>
-        <w:rPr>
-          <w:rFonts w:ascii="Arial" w:eastAsia="Times New Roman" w:hAnsi="Arial" w:cs="Arial"/>
-          <w:color w:val="000000"/>
-          <w:kern w:val="0"/>
-          <w:lang w:eastAsia="de-DE"/>
-          <w14:ligatures w14:val="none"/>
-        </w:rPr>
-        <w:t xml:space="preserve">Woche 2 &amp; Woche 3 (Backend-Entwicklung, </w:t>
-      </w:r>
-      <w:proofErr w:type="spellStart"/>
-      <w:r>
-        <w:rPr>
-          <w:rFonts w:ascii="Arial" w:eastAsia="Times New Roman" w:hAnsi="Arial" w:cs="Arial"/>
-          <w:color w:val="000000"/>
-          <w:kern w:val="0"/>
-          <w:lang w:eastAsia="de-DE"/>
-          <w14:ligatures w14:val="none"/>
-        </w:rPr>
-        <w:t>Refactoring</w:t>
-      </w:r>
-      <w:proofErr w:type="spellEnd"/>
-      <w:r>
-        <w:rPr>
-          <w:rFonts w:ascii="Arial" w:eastAsia="Times New Roman" w:hAnsi="Arial" w:cs="Arial"/>
-          <w:color w:val="000000"/>
-          <w:kern w:val="0"/>
-          <w:lang w:eastAsia="de-DE"/>
-          <w14:ligatures w14:val="none"/>
-        </w:rPr>
-        <w:t xml:space="preserve"> &amp; Frontend-Basis)</w:t>
+          <w:sz w:val="27"/>
+          <w:szCs w:val="27"/>
+          <w:lang w:eastAsia="de-DE"/>
+          <w14:ligatures w14:val="none"/>
+        </w:rPr>
+      </w:pPr>
+      <w:r>
+        <w:rPr>
+          <w:rFonts w:ascii="Arial" w:eastAsia="Times New Roman" w:hAnsi="Arial" w:cs="Arial"/>
+          <w:b/>
+          <w:bCs/>
+          <w:color w:val="000000"/>
+          <w:kern w:val="0"/>
+          <w:sz w:val="27"/>
+          <w:szCs w:val="27"/>
+          <w:lang w:eastAsia="de-DE"/>
+          <w14:ligatures w14:val="none"/>
+        </w:rPr>
+        <w:t>1. Strategie des KI-Einsatzes</w:t>
       </w:r>
     </w:p>
     <w:p>
       <w:pPr>
         <w:spacing w:after="100" w:afterAutospacing="1"/>
-        <w:outlineLvl w:val="2"/>
-        <w:rPr>
-          <w:rFonts w:ascii="Arial" w:eastAsia="Times New Roman" w:hAnsi="Arial" w:cs="Arial"/>
-          <w:b/>
-          <w:bCs/>
-          <w:color w:val="000000"/>
-          <w:kern w:val="0"/>
-          <w:sz w:val="27"/>
-          <w:szCs w:val="27"/>
-          <w:lang w:eastAsia="de-DE"/>
-          <w14:ligatures w14:val="none"/>
-        </w:rPr>
-      </w:pPr>
-      <w:r>
-        <w:rPr>
-          <w:rFonts w:ascii="Arial" w:eastAsia="Times New Roman" w:hAnsi="Arial" w:cs="Arial"/>
-          <w:b/>
-          <w:bCs/>
-          <w:color w:val="000000"/>
-          <w:kern w:val="0"/>
-          <w:sz w:val="27"/>
-          <w:szCs w:val="27"/>
-          <w:lang w:eastAsia="de-DE"/>
-          <w14:ligatures w14:val="none"/>
-        </w:rPr>
-        <w:t>1. Strategie des KI-Einsatzes</w:t>
-      </w:r>
-    </w:p>
-    <w:p>
-      <w:pPr>
-        <w:spacing w:after="100" w:afterAutospacing="1"/>
-        <w:rPr>
-          <w:rFonts w:ascii="Arial" w:eastAsia="Times New Roman" w:hAnsi="Arial" w:cs="Arial"/>
-          <w:color w:val="000000"/>
-          <w:kern w:val="0"/>
-          <w:lang w:eastAsia="de-DE"/>
-          <w14:ligatures w14:val="none"/>
-        </w:rPr>
-      </w:pPr>
-      <w:r>
-        <w:rPr>
-          <w:rFonts w:ascii="Arial" w:eastAsia="Times New Roman" w:hAnsi="Arial" w:cs="Arial"/>
-          <w:color w:val="000000"/>
-          <w:kern w:val="0"/>
-          <w:lang w:eastAsia="de-DE"/>
-          <w14:ligatures w14:val="none"/>
-        </w:rPr>
-        <w:t xml:space="preserve">Die KI wurde nicht zum blinden Generieren von Code genutzt, sondern als interaktiver "Pair </w:t>
-      </w:r>
-      <w:proofErr w:type="spellStart"/>
-      <w:r>
-        <w:rPr>
-          <w:rFonts w:ascii="Arial" w:eastAsia="Times New Roman" w:hAnsi="Arial" w:cs="Arial"/>
-          <w:color w:val="000000"/>
-          <w:kern w:val="0"/>
-          <w:lang w:eastAsia="de-DE"/>
-          <w14:ligatures w14:val="none"/>
-        </w:rPr>
-        <w:t>Programmer</w:t>
-      </w:r>
-      <w:proofErr w:type="spellEnd"/>
-      <w:r>
-        <w:rPr>
-          <w:rFonts w:ascii="Arial" w:eastAsia="Times New Roman" w:hAnsi="Arial" w:cs="Arial"/>
-          <w:color w:val="000000"/>
-          <w:kern w:val="0"/>
-          <w:lang w:eastAsia="de-DE"/>
-          <w14:ligatures w14:val="none"/>
-        </w:rPr>
-        <w:t>". Der Fokus lag auf:</w:t>
+        <w:rPr>
+          <w:rFonts w:ascii="Arial" w:eastAsia="Times New Roman" w:hAnsi="Arial" w:cs="Arial"/>
+          <w:color w:val="000000"/>
+          <w:kern w:val="0"/>
+          <w:lang w:eastAsia="de-DE"/>
+          <w14:ligatures w14:val="none"/>
+        </w:rPr>
+      </w:pPr>
+      <w:r>
+        <w:rPr>
+          <w:rFonts w:ascii="Arial" w:eastAsia="Times New Roman" w:hAnsi="Arial" w:cs="Arial"/>
+          <w:color w:val="000000"/>
+          <w:kern w:val="0"/>
+          <w:lang w:eastAsia="de-DE"/>
+          <w14:ligatures w14:val="none"/>
+        </w:rPr>
+        <w:t>Die KI wurde nicht zum blinden Generieren von Code genutzt, sondern als interaktiver "Pair Programmer". Der Fokus lag auf:</w:t>
       </w:r>
     </w:p>
     <w:p>
@@ -416,7 +322,6 @@
           <w14:ligatures w14:val="none"/>
         </w:rPr>
       </w:pPr>
-      <w:proofErr w:type="spellStart"/>
       <w:r>
         <w:rPr>
           <w:rFonts w:ascii="Arial" w:eastAsia="Times New Roman" w:hAnsi="Arial" w:cs="Arial"/>
@@ -427,20 +332,7 @@
           <w:lang w:eastAsia="de-DE"/>
           <w14:ligatures w14:val="none"/>
         </w:rPr>
-        <w:t>Seeding</w:t>
-      </w:r>
-      <w:proofErr w:type="spellEnd"/>
-      <w:r>
-        <w:rPr>
-          <w:rFonts w:ascii="Arial" w:eastAsia="Times New Roman" w:hAnsi="Arial" w:cs="Arial"/>
-          <w:b/>
-          <w:bCs/>
-          <w:color w:val="000000"/>
-          <w:kern w:val="0"/>
-          <w:lang w:eastAsia="de-DE"/>
-          <w14:ligatures w14:val="none"/>
-        </w:rPr>
-        <w:t xml:space="preserve"> &amp; Models:</w:t>
+        <w:t>Seeding &amp; Models:</w:t>
       </w:r>
       <w:r>
         <w:rPr>
@@ -709,29 +601,7 @@
           <w:lang w:eastAsia="de-DE"/>
           <w14:ligatures w14:val="none"/>
         </w:rPr>
-        <w:t>Ein relationales Modell mit 6 Tabellen (</w:t>
-      </w:r>
-      <w:proofErr w:type="spellStart"/>
-      <w:r>
-        <w:rPr>
-          <w:rFonts w:ascii="Arial" w:eastAsia="Times New Roman" w:hAnsi="Arial" w:cs="Arial"/>
-          <w:color w:val="000000"/>
-          <w:kern w:val="0"/>
-          <w:lang w:eastAsia="de-DE"/>
-          <w14:ligatures w14:val="none"/>
-        </w:rPr>
-        <w:t>exercises</w:t>
-      </w:r>
-      <w:proofErr w:type="spellEnd"/>
-      <w:r>
-        <w:rPr>
-          <w:rFonts w:ascii="Arial" w:eastAsia="Times New Roman" w:hAnsi="Arial" w:cs="Arial"/>
-          <w:color w:val="000000"/>
-          <w:kern w:val="0"/>
-          <w:lang w:eastAsia="de-DE"/>
-          <w14:ligatures w14:val="none"/>
-        </w:rPr>
-        <w:t>,</w:t>
+        <w:t>Ein relationales Modell mit 6 Tabellen (exercises,</w:t>
       </w:r>
       <w:r>
         <w:rPr>
@@ -743,27 +613,15 @@
         </w:rPr>
         <w:t xml:space="preserve"> </w:t>
       </w:r>
-      <w:proofErr w:type="spellStart"/>
-      <w:r>
-        <w:rPr>
-          <w:rFonts w:ascii="Arial" w:eastAsia="Times New Roman" w:hAnsi="Arial" w:cs="Arial"/>
-          <w:color w:val="000000"/>
-          <w:kern w:val="0"/>
-          <w:lang w:eastAsia="de-DE"/>
-          <w14:ligatures w14:val="none"/>
-        </w:rPr>
-        <w:t>workouts</w:t>
-      </w:r>
-      <w:proofErr w:type="spellEnd"/>
-      <w:r>
-        <w:rPr>
-          <w:rFonts w:ascii="Arial" w:eastAsia="Times New Roman" w:hAnsi="Arial" w:cs="Arial"/>
-          <w:color w:val="000000"/>
-          <w:kern w:val="0"/>
-          <w:lang w:eastAsia="de-DE"/>
-          <w14:ligatures w14:val="none"/>
-        </w:rPr>
-        <w:t>,</w:t>
+      <w:r>
+        <w:rPr>
+          <w:rFonts w:ascii="Arial" w:eastAsia="Times New Roman" w:hAnsi="Arial" w:cs="Arial"/>
+          <w:color w:val="000000"/>
+          <w:kern w:val="0"/>
+          <w:lang w:eastAsia="de-DE"/>
+          <w14:ligatures w14:val="none"/>
+        </w:rPr>
+        <w:t>workouts,</w:t>
       </w:r>
       <w:r>
         <w:rPr>
@@ -775,27 +633,15 @@
         </w:rPr>
         <w:t xml:space="preserve"> </w:t>
       </w:r>
-      <w:proofErr w:type="spellStart"/>
-      <w:r>
-        <w:rPr>
-          <w:rFonts w:ascii="Arial" w:eastAsia="Times New Roman" w:hAnsi="Arial" w:cs="Arial"/>
-          <w:color w:val="000000"/>
-          <w:kern w:val="0"/>
-          <w:lang w:eastAsia="de-DE"/>
-          <w14:ligatures w14:val="none"/>
-        </w:rPr>
-        <w:t>routines</w:t>
-      </w:r>
-      <w:proofErr w:type="spellEnd"/>
-      <w:r>
-        <w:rPr>
-          <w:rFonts w:ascii="Arial" w:eastAsia="Times New Roman" w:hAnsi="Arial" w:cs="Arial"/>
-          <w:color w:val="000000"/>
-          <w:kern w:val="0"/>
-          <w:lang w:eastAsia="de-DE"/>
-          <w14:ligatures w14:val="none"/>
-        </w:rPr>
-        <w:t>,</w:t>
+      <w:r>
+        <w:rPr>
+          <w:rFonts w:ascii="Arial" w:eastAsia="Times New Roman" w:hAnsi="Arial" w:cs="Arial"/>
+          <w:color w:val="000000"/>
+          <w:kern w:val="0"/>
+          <w:lang w:eastAsia="de-DE"/>
+          <w14:ligatures w14:val="none"/>
+        </w:rPr>
+        <w:t>routines,</w:t>
       </w:r>
       <w:r>
         <w:rPr>
@@ -807,27 +653,15 @@
         </w:rPr>
         <w:t xml:space="preserve"> </w:t>
       </w:r>
-      <w:proofErr w:type="spellStart"/>
-      <w:r>
-        <w:rPr>
-          <w:rFonts w:ascii="Arial" w:eastAsia="Times New Roman" w:hAnsi="Arial" w:cs="Arial"/>
-          <w:color w:val="000000"/>
-          <w:kern w:val="0"/>
-          <w:lang w:eastAsia="de-DE"/>
-          <w14:ligatures w14:val="none"/>
-        </w:rPr>
-        <w:t>routine_exercises</w:t>
-      </w:r>
-      <w:proofErr w:type="spellEnd"/>
-      <w:r>
-        <w:rPr>
-          <w:rFonts w:ascii="Arial" w:eastAsia="Times New Roman" w:hAnsi="Arial" w:cs="Arial"/>
-          <w:color w:val="000000"/>
-          <w:kern w:val="0"/>
-          <w:lang w:eastAsia="de-DE"/>
-          <w14:ligatures w14:val="none"/>
-        </w:rPr>
-        <w:t>,</w:t>
+      <w:r>
+        <w:rPr>
+          <w:rFonts w:ascii="Arial" w:eastAsia="Times New Roman" w:hAnsi="Arial" w:cs="Arial"/>
+          <w:color w:val="000000"/>
+          <w:kern w:val="0"/>
+          <w:lang w:eastAsia="de-DE"/>
+          <w14:ligatures w14:val="none"/>
+        </w:rPr>
+        <w:t>routine_exercises,</w:t>
       </w:r>
       <w:r>
         <w:rPr>
@@ -839,27 +673,15 @@
         </w:rPr>
         <w:t xml:space="preserve"> </w:t>
       </w:r>
-      <w:proofErr w:type="spellStart"/>
-      <w:r>
-        <w:rPr>
-          <w:rFonts w:ascii="Arial" w:eastAsia="Times New Roman" w:hAnsi="Arial" w:cs="Arial"/>
-          <w:color w:val="000000"/>
-          <w:kern w:val="0"/>
-          <w:lang w:eastAsia="de-DE"/>
-          <w14:ligatures w14:val="none"/>
-        </w:rPr>
-        <w:t>measurements</w:t>
-      </w:r>
-      <w:proofErr w:type="spellEnd"/>
-      <w:r>
-        <w:rPr>
-          <w:rFonts w:ascii="Arial" w:eastAsia="Times New Roman" w:hAnsi="Arial" w:cs="Arial"/>
-          <w:color w:val="000000"/>
-          <w:kern w:val="0"/>
-          <w:lang w:eastAsia="de-DE"/>
-          <w14:ligatures w14:val="none"/>
-        </w:rPr>
-        <w:t>,</w:t>
+      <w:r>
+        <w:rPr>
+          <w:rFonts w:ascii="Arial" w:eastAsia="Times New Roman" w:hAnsi="Arial" w:cs="Arial"/>
+          <w:color w:val="000000"/>
+          <w:kern w:val="0"/>
+          <w:lang w:eastAsia="de-DE"/>
+          <w14:ligatures w14:val="none"/>
+        </w:rPr>
+        <w:t>measurements,</w:t>
       </w:r>
       <w:r>
         <w:rPr>
@@ -871,49 +693,15 @@
         </w:rPr>
         <w:t xml:space="preserve"> </w:t>
       </w:r>
-      <w:proofErr w:type="spellStart"/>
-      <w:r>
-        <w:rPr>
-          <w:rFonts w:ascii="Arial" w:eastAsia="Times New Roman" w:hAnsi="Arial" w:cs="Arial"/>
-          <w:color w:val="000000"/>
-          <w:kern w:val="0"/>
-          <w:lang w:eastAsia="de-DE"/>
-          <w14:ligatures w14:val="none"/>
-        </w:rPr>
-        <w:t>strength_standards</w:t>
-      </w:r>
-      <w:proofErr w:type="spellEnd"/>
-      <w:r>
-        <w:rPr>
-          <w:rFonts w:ascii="Arial" w:eastAsia="Times New Roman" w:hAnsi="Arial" w:cs="Arial"/>
-          <w:color w:val="000000"/>
-          <w:kern w:val="0"/>
-          <w:lang w:eastAsia="de-DE"/>
-          <w14:ligatures w14:val="none"/>
-        </w:rPr>
-        <w:t xml:space="preserve">), korrekt verknüpft über </w:t>
-      </w:r>
-      <w:proofErr w:type="spellStart"/>
-      <w:r>
-        <w:rPr>
-          <w:rFonts w:ascii="Arial" w:eastAsia="Times New Roman" w:hAnsi="Arial" w:cs="Arial"/>
-          <w:color w:val="000000"/>
-          <w:kern w:val="0"/>
-          <w:lang w:eastAsia="de-DE"/>
-          <w14:ligatures w14:val="none"/>
-        </w:rPr>
-        <w:t>Foreign</w:t>
-      </w:r>
-      <w:proofErr w:type="spellEnd"/>
-      <w:r>
-        <w:rPr>
-          <w:rFonts w:ascii="Arial" w:eastAsia="Times New Roman" w:hAnsi="Arial" w:cs="Arial"/>
-          <w:color w:val="000000"/>
-          <w:kern w:val="0"/>
-          <w:lang w:eastAsia="de-DE"/>
-          <w14:ligatures w14:val="none"/>
-        </w:rPr>
-        <w:t xml:space="preserve"> Keys.</w:t>
+      <w:r>
+        <w:rPr>
+          <w:rFonts w:ascii="Arial" w:eastAsia="Times New Roman" w:hAnsi="Arial" w:cs="Arial"/>
+          <w:color w:val="000000"/>
+          <w:kern w:val="0"/>
+          <w:lang w:eastAsia="de-DE"/>
+          <w14:ligatures w14:val="none"/>
+        </w:rPr>
+        <w:t>strength_standards), korrekt verknüpft über Foreign Keys.</w:t>
       </w:r>
     </w:p>
     <w:p>
@@ -937,33 +725,7 @@
           <w:lang w:eastAsia="de-DE"/>
           <w14:ligatures w14:val="none"/>
         </w:rPr>
-        <w:t xml:space="preserve">Phase 2: Data </w:t>
-      </w:r>
-      <w:proofErr w:type="spellStart"/>
-      <w:r>
-        <w:rPr>
-          <w:rFonts w:ascii="Arial" w:eastAsia="Times New Roman" w:hAnsi="Arial" w:cs="Arial"/>
-          <w:b/>
-          <w:bCs/>
-          <w:color w:val="000000"/>
-          <w:kern w:val="0"/>
-          <w:lang w:eastAsia="de-DE"/>
-          <w14:ligatures w14:val="none"/>
-        </w:rPr>
-        <w:t>Seeding</w:t>
-      </w:r>
-      <w:proofErr w:type="spellEnd"/>
-      <w:r>
-        <w:rPr>
-          <w:rFonts w:ascii="Arial" w:eastAsia="Times New Roman" w:hAnsi="Arial" w:cs="Arial"/>
-          <w:b/>
-          <w:bCs/>
-          <w:color w:val="000000"/>
-          <w:kern w:val="0"/>
-          <w:lang w:eastAsia="de-DE"/>
-          <w14:ligatures w14:val="none"/>
-        </w:rPr>
-        <w:t xml:space="preserve"> (Automatisierung)</w:t>
+        <w:t>Phase 2: Data Seeding (Automatisierung)</w:t>
       </w:r>
     </w:p>
     <w:p>
@@ -1133,29 +895,7 @@
           <w:lang w:eastAsia="de-DE"/>
           <w14:ligatures w14:val="none"/>
         </w:rPr>
-        <w:t>Ein SQL-Transaktions-Skript, das automatisch 75 Übungen mit Metadaten (</w:t>
-      </w:r>
-      <w:proofErr w:type="spellStart"/>
-      <w:r>
-        <w:rPr>
-          <w:rFonts w:ascii="Arial" w:eastAsia="Times New Roman" w:hAnsi="Arial" w:cs="Arial"/>
-          <w:color w:val="000000"/>
-          <w:kern w:val="0"/>
-          <w:lang w:eastAsia="de-DE"/>
-          <w14:ligatures w14:val="none"/>
-        </w:rPr>
-        <w:t>default_rest_seconds</w:t>
-      </w:r>
-      <w:proofErr w:type="spellEnd"/>
-      <w:r>
-        <w:rPr>
-          <w:rFonts w:ascii="Arial" w:eastAsia="Times New Roman" w:hAnsi="Arial" w:cs="Arial"/>
-          <w:color w:val="000000"/>
-          <w:kern w:val="0"/>
-          <w:lang w:eastAsia="de-DE"/>
-          <w14:ligatures w14:val="none"/>
-        </w:rPr>
-        <w:t>) in die Datenbank lädt.</w:t>
+        <w:t>Ein SQL-Transaktions-Skript, das automatisch 75 Übungen mit Metadaten (default_rest_seconds) in die Datenbank lädt.</w:t>
       </w:r>
     </w:p>
     <w:p>
@@ -1290,33 +1030,7 @@
           <w:lang w:eastAsia="de-DE"/>
           <w14:ligatures w14:val="none"/>
         </w:rPr>
-        <w:t xml:space="preserve">"Ich möchte ein Ranking-System. Wenn der User beim Bankdrücken 100kg schafft, soll das Backend berechnen, zu welchen Top % er gehört (z.B. </w:t>
-      </w:r>
-      <w:proofErr w:type="spellStart"/>
-      <w:r>
-        <w:rPr>
-          <w:rFonts w:ascii="Arial" w:eastAsia="Times New Roman" w:hAnsi="Arial" w:cs="Arial"/>
-          <w:i/>
-          <w:iCs/>
-          <w:color w:val="000000"/>
-          <w:kern w:val="0"/>
-          <w:lang w:eastAsia="de-DE"/>
-          <w14:ligatures w14:val="none"/>
-        </w:rPr>
-        <w:t>Advanced</w:t>
-      </w:r>
-      <w:proofErr w:type="spellEnd"/>
-      <w:r>
-        <w:rPr>
-          <w:rFonts w:ascii="Arial" w:eastAsia="Times New Roman" w:hAnsi="Arial" w:cs="Arial"/>
-          <w:i/>
-          <w:iCs/>
-          <w:color w:val="000000"/>
-          <w:kern w:val="0"/>
-          <w:lang w:eastAsia="de-DE"/>
-          <w14:ligatures w14:val="none"/>
-        </w:rPr>
-        <w:t xml:space="preserve"> oder Elite). Erstelle eine Logik, die den User-Rekord mit einer Referenztabelle vergleicht und ein Ranking inkl. Icon zurückgibt."</w:t>
+        <w:t>"Ich möchte ein Ranking-System. Wenn der User beim Bankdrücken 100kg schafft, soll das Backend berechnen, zu welchen Top % er gehört (z.B. Advanced oder Elite). Erstelle eine Logik, die den User-Rekord mit einer Referenztabelle vergleicht und ein Ranking inkl. Icon zurückgibt."</w:t>
       </w:r>
     </w:p>
     <w:p>
@@ -1364,116 +1078,8 @@
           <w:lang w:eastAsia="de-DE"/>
           <w14:ligatures w14:val="none"/>
         </w:rPr>
-        <w:t>Neue Tabelle</w:t>
-      </w:r>
-      <w:r>
-        <w:rPr>
-          <w:rFonts w:ascii="Arial" w:eastAsia="Times New Roman" w:hAnsi="Arial" w:cs="Arial"/>
-          <w:color w:val="000000"/>
-          <w:kern w:val="0"/>
-          <w:lang w:eastAsia="de-DE"/>
-          <w14:ligatures w14:val="none"/>
-        </w:rPr>
-        <w:t xml:space="preserve"> </w:t>
-      </w:r>
-      <w:proofErr w:type="spellStart"/>
-      <w:r>
-        <w:rPr>
-          <w:rFonts w:ascii="Arial" w:eastAsia="Times New Roman" w:hAnsi="Arial" w:cs="Arial"/>
-          <w:color w:val="000000"/>
-          <w:kern w:val="0"/>
-          <w:lang w:eastAsia="de-DE"/>
-          <w14:ligatures w14:val="none"/>
-        </w:rPr>
-        <w:t>strength_standards</w:t>
-      </w:r>
-      <w:proofErr w:type="spellEnd"/>
-      <w:r>
-        <w:rPr>
-          <w:rFonts w:ascii="Arial" w:eastAsia="Times New Roman" w:hAnsi="Arial" w:cs="Arial"/>
-          <w:color w:val="000000"/>
-          <w:kern w:val="0"/>
-          <w:lang w:eastAsia="de-DE"/>
-          <w14:ligatures w14:val="none"/>
-        </w:rPr>
-        <w:t>. API-Endpunkt</w:t>
-      </w:r>
-      <w:r>
-        <w:rPr>
-          <w:rFonts w:ascii="Arial" w:eastAsia="Times New Roman" w:hAnsi="Arial" w:cs="Arial"/>
-          <w:color w:val="000000"/>
-          <w:kern w:val="0"/>
-          <w:lang w:eastAsia="de-DE"/>
-          <w14:ligatures w14:val="none"/>
-        </w:rPr>
-        <w:t xml:space="preserve"> </w:t>
-      </w:r>
-      <w:r>
-        <w:rPr>
-          <w:rFonts w:ascii="Arial" w:eastAsia="Times New Roman" w:hAnsi="Arial" w:cs="Arial"/>
-          <w:color w:val="000000"/>
-          <w:kern w:val="0"/>
-          <w:lang w:eastAsia="de-DE"/>
-          <w14:ligatures w14:val="none"/>
-        </w:rPr>
-        <w:t>GET /</w:t>
-      </w:r>
-      <w:proofErr w:type="spellStart"/>
-      <w:r>
-        <w:rPr>
-          <w:rFonts w:ascii="Arial" w:eastAsia="Times New Roman" w:hAnsi="Arial" w:cs="Arial"/>
-          <w:color w:val="000000"/>
-          <w:kern w:val="0"/>
-          <w:lang w:eastAsia="de-DE"/>
-          <w14:ligatures w14:val="none"/>
-        </w:rPr>
-        <w:t>api</w:t>
-      </w:r>
-      <w:proofErr w:type="spellEnd"/>
-      <w:r>
-        <w:rPr>
-          <w:rFonts w:ascii="Arial" w:eastAsia="Times New Roman" w:hAnsi="Arial" w:cs="Arial"/>
-          <w:color w:val="000000"/>
-          <w:kern w:val="0"/>
-          <w:lang w:eastAsia="de-DE"/>
-          <w14:ligatures w14:val="none"/>
-        </w:rPr>
-        <w:t>/</w:t>
-      </w:r>
-      <w:proofErr w:type="spellStart"/>
-      <w:r>
-        <w:rPr>
-          <w:rFonts w:ascii="Arial" w:eastAsia="Times New Roman" w:hAnsi="Arial" w:cs="Arial"/>
-          <w:color w:val="000000"/>
-          <w:kern w:val="0"/>
-          <w:lang w:eastAsia="de-DE"/>
-          <w14:ligatures w14:val="none"/>
-        </w:rPr>
-        <w:t>stats</w:t>
-      </w:r>
-      <w:proofErr w:type="spellEnd"/>
-      <w:r>
-        <w:rPr>
-          <w:rFonts w:ascii="Arial" w:eastAsia="Times New Roman" w:hAnsi="Arial" w:cs="Arial"/>
-          <w:color w:val="000000"/>
-          <w:kern w:val="0"/>
-          <w:lang w:eastAsia="de-DE"/>
-          <w14:ligatures w14:val="none"/>
-        </w:rPr>
-        <w:t>/</w:t>
-      </w:r>
-      <w:proofErr w:type="spellStart"/>
-      <w:r>
-        <w:rPr>
-          <w:rFonts w:ascii="Arial" w:eastAsia="Times New Roman" w:hAnsi="Arial" w:cs="Arial"/>
-          <w:color w:val="000000"/>
-          <w:kern w:val="0"/>
-          <w:lang w:eastAsia="de-DE"/>
-          <w14:ligatures w14:val="none"/>
-        </w:rPr>
-        <w:t>ranking</w:t>
-      </w:r>
-      <w:proofErr w:type="spellEnd"/>
+        <w:t>Neue Tabelle strength_standards. API-Endpunkt GET /api/stats/ranking</w:t>
+      </w:r>
       <w:proofErr w:type="gramStart"/>
       <w:r>
         <w:rPr>
@@ -1507,7 +1113,6 @@
         </w:rPr>
         <w:t>MAX(</w:t>
       </w:r>
-      <w:proofErr w:type="spellStart"/>
       <w:proofErr w:type="gramEnd"/>
       <w:r>
         <w:rPr>
@@ -1517,18 +1122,7 @@
           <w:lang w:eastAsia="de-DE"/>
           <w14:ligatures w14:val="none"/>
         </w:rPr>
-        <w:t>weight_kg</w:t>
-      </w:r>
-      <w:proofErr w:type="spellEnd"/>
-      <w:r>
-        <w:rPr>
-          <w:rFonts w:ascii="Arial" w:eastAsia="Times New Roman" w:hAnsi="Arial" w:cs="Arial"/>
-          <w:color w:val="000000"/>
-          <w:kern w:val="0"/>
-          <w:lang w:eastAsia="de-DE"/>
-          <w14:ligatures w14:val="none"/>
-        </w:rPr>
-        <w:t>)) ermittelt und dynamisch in Kategorien (Beginner bis Elite) einordnet.</w:t>
+        <w:t>weight_kg)) ermittelt und dynamisch in Kategorien (Beginner bis Elite) einordnet.</w:t>
       </w:r>
     </w:p>
     <w:p>
@@ -1576,33 +1170,7 @@
           <w:lang w:eastAsia="de-DE"/>
           <w14:ligatures w14:val="none"/>
         </w:rPr>
-        <w:t>: Backend-</w:t>
-      </w:r>
-      <w:proofErr w:type="spellStart"/>
-      <w:r>
-        <w:rPr>
-          <w:rFonts w:ascii="Arial" w:eastAsia="Times New Roman" w:hAnsi="Arial" w:cs="Arial"/>
-          <w:b/>
-          <w:bCs/>
-          <w:color w:val="000000"/>
-          <w:kern w:val="0"/>
-          <w:lang w:eastAsia="de-DE"/>
-          <w14:ligatures w14:val="none"/>
-        </w:rPr>
-        <w:t>Refactoring</w:t>
-      </w:r>
-      <w:proofErr w:type="spellEnd"/>
-      <w:r>
-        <w:rPr>
-          <w:rFonts w:ascii="Arial" w:eastAsia="Times New Roman" w:hAnsi="Arial" w:cs="Arial"/>
-          <w:b/>
-          <w:bCs/>
-          <w:color w:val="000000"/>
-          <w:kern w:val="0"/>
-          <w:lang w:eastAsia="de-DE"/>
-          <w14:ligatures w14:val="none"/>
-        </w:rPr>
-        <w:t xml:space="preserve"> (Saubere Architektur)</w:t>
+        <w:t>: Backend-Refactoring (Saubere Architektur)</w:t>
       </w:r>
     </w:p>
     <w:p>
@@ -1728,7 +1296,6 @@
           <w14:ligatures w14:val="none"/>
         </w:rPr>
       </w:pPr>
-      <w:proofErr w:type="spellStart"/>
       <w:r>
         <w:rPr>
           <w:rFonts w:ascii="Arial" w:eastAsia="Times New Roman" w:hAnsi="Arial" w:cs="Arial"/>
@@ -1751,9 +1318,9 @@
           <w:lang w:eastAsia="de-DE"/>
           <w14:ligatures w14:val="none"/>
         </w:rPr>
-        <w:t>"Wie</w:t>
-      </w:r>
-      <w:proofErr w:type="spellEnd"/>
+        <w:t xml:space="preserve">"Wie mache ich die Struktur meines backends </w:t>
+      </w:r>
+      <w:proofErr w:type="gramStart"/>
       <w:r>
         <w:rPr>
           <w:rFonts w:ascii="Arial" w:eastAsia="Times New Roman" w:hAnsi="Arial" w:cs="Arial"/>
@@ -1764,9 +1331,9 @@
           <w:lang w:eastAsia="de-DE"/>
           <w14:ligatures w14:val="none"/>
         </w:rPr>
-        <w:t xml:space="preserve"> mache ich die Struktur meines </w:t>
-      </w:r>
-      <w:proofErr w:type="spellStart"/>
+        <w:t>also</w:t>
+      </w:r>
+      <w:proofErr w:type="gramEnd"/>
       <w:r>
         <w:rPr>
           <w:rFonts w:ascii="Arial" w:eastAsia="Times New Roman" w:hAnsi="Arial" w:cs="Arial"/>
@@ -1777,9 +1344,8 @@
           <w:lang w:eastAsia="de-DE"/>
           <w14:ligatures w14:val="none"/>
         </w:rPr>
-        <w:t>backends</w:t>
-      </w:r>
-      <w:proofErr w:type="spellEnd"/>
+        <w:t xml:space="preserve"> dass es schöner ist. Mach es mit </w:t>
+      </w:r>
       <w:r>
         <w:rPr>
           <w:rFonts w:ascii="Arial" w:eastAsia="Times New Roman" w:hAnsi="Arial" w:cs="Arial"/>
@@ -1790,9 +1356,8 @@
           <w:lang w:eastAsia="de-DE"/>
           <w14:ligatures w14:val="none"/>
         </w:rPr>
-        <w:t xml:space="preserve"> </w:t>
-      </w:r>
-      <w:proofErr w:type="gramStart"/>
+        <w:t xml:space="preserve">einem </w:t>
+      </w:r>
       <w:r>
         <w:rPr>
           <w:rFonts w:ascii="Arial" w:eastAsia="Times New Roman" w:hAnsi="Arial" w:cs="Arial"/>
@@ -1803,162 +1368,7 @@
           <w:lang w:eastAsia="de-DE"/>
           <w14:ligatures w14:val="none"/>
         </w:rPr>
-        <w:t>also</w:t>
-      </w:r>
-      <w:proofErr w:type="gramEnd"/>
-      <w:r>
-        <w:rPr>
-          <w:rFonts w:ascii="Arial" w:eastAsia="Times New Roman" w:hAnsi="Arial" w:cs="Arial"/>
-          <w:i/>
-          <w:iCs/>
-          <w:color w:val="000000"/>
-          <w:kern w:val="0"/>
-          <w:lang w:eastAsia="de-DE"/>
-          <w14:ligatures w14:val="none"/>
-        </w:rPr>
-        <w:t xml:space="preserve"> dass es schöner ist. Mach es mit </w:t>
-      </w:r>
-      <w:r>
-        <w:rPr>
-          <w:rFonts w:ascii="Arial" w:eastAsia="Times New Roman" w:hAnsi="Arial" w:cs="Arial"/>
-          <w:i/>
-          <w:iCs/>
-          <w:color w:val="000000"/>
-          <w:kern w:val="0"/>
-          <w:lang w:eastAsia="de-DE"/>
-          <w14:ligatures w14:val="none"/>
-        </w:rPr>
-        <w:t xml:space="preserve">einem </w:t>
-      </w:r>
-      <w:proofErr w:type="spellStart"/>
-      <w:r>
-        <w:rPr>
-          <w:rFonts w:ascii="Arial" w:eastAsia="Times New Roman" w:hAnsi="Arial" w:cs="Arial"/>
-          <w:i/>
-          <w:iCs/>
-          <w:color w:val="000000"/>
-          <w:kern w:val="0"/>
-          <w:lang w:eastAsia="de-DE"/>
-          <w14:ligatures w14:val="none"/>
-        </w:rPr>
-        <w:t>src</w:t>
-      </w:r>
-      <w:proofErr w:type="spellEnd"/>
-      <w:r>
-        <w:rPr>
-          <w:rFonts w:ascii="Arial" w:eastAsia="Times New Roman" w:hAnsi="Arial" w:cs="Arial"/>
-          <w:i/>
-          <w:iCs/>
-          <w:color w:val="000000"/>
-          <w:kern w:val="0"/>
-          <w:lang w:eastAsia="de-DE"/>
-          <w14:ligatures w14:val="none"/>
-        </w:rPr>
-        <w:t xml:space="preserve"> Ordner und den </w:t>
-      </w:r>
-      <w:proofErr w:type="spellStart"/>
-      <w:r>
-        <w:rPr>
-          <w:rFonts w:ascii="Arial" w:eastAsia="Times New Roman" w:hAnsi="Arial" w:cs="Arial"/>
-          <w:i/>
-          <w:iCs/>
-          <w:color w:val="000000"/>
-          <w:kern w:val="0"/>
-          <w:lang w:eastAsia="de-DE"/>
-          <w14:ligatures w14:val="none"/>
-        </w:rPr>
-        <w:t>unterordnern</w:t>
-      </w:r>
-      <w:proofErr w:type="spellEnd"/>
-      <w:r>
-        <w:rPr>
-          <w:rFonts w:ascii="Arial" w:eastAsia="Times New Roman" w:hAnsi="Arial" w:cs="Arial"/>
-          <w:i/>
-          <w:iCs/>
-          <w:color w:val="000000"/>
-          <w:kern w:val="0"/>
-          <w:lang w:eastAsia="de-DE"/>
-          <w14:ligatures w14:val="none"/>
-        </w:rPr>
-        <w:t xml:space="preserve">: </w:t>
-      </w:r>
-      <w:proofErr w:type="spellStart"/>
-      <w:r>
-        <w:rPr>
-          <w:rFonts w:ascii="Arial" w:eastAsia="Times New Roman" w:hAnsi="Arial" w:cs="Arial"/>
-          <w:i/>
-          <w:iCs/>
-          <w:color w:val="000000"/>
-          <w:kern w:val="0"/>
-          <w:lang w:eastAsia="de-DE"/>
-          <w14:ligatures w14:val="none"/>
-        </w:rPr>
-        <w:t>middleware</w:t>
-      </w:r>
-      <w:proofErr w:type="spellEnd"/>
-      <w:r>
-        <w:rPr>
-          <w:rFonts w:ascii="Arial" w:eastAsia="Times New Roman" w:hAnsi="Arial" w:cs="Arial"/>
-          <w:i/>
-          <w:iCs/>
-          <w:color w:val="000000"/>
-          <w:kern w:val="0"/>
-          <w:lang w:eastAsia="de-DE"/>
-          <w14:ligatures w14:val="none"/>
-        </w:rPr>
-        <w:t xml:space="preserve">, </w:t>
-      </w:r>
-      <w:proofErr w:type="spellStart"/>
-      <w:r>
-        <w:rPr>
-          <w:rFonts w:ascii="Arial" w:eastAsia="Times New Roman" w:hAnsi="Arial" w:cs="Arial"/>
-          <w:i/>
-          <w:iCs/>
-          <w:color w:val="000000"/>
-          <w:kern w:val="0"/>
-          <w:lang w:eastAsia="de-DE"/>
-          <w14:ligatures w14:val="none"/>
-        </w:rPr>
-        <w:t>models</w:t>
-      </w:r>
-      <w:proofErr w:type="spellEnd"/>
-      <w:r>
-        <w:rPr>
-          <w:rFonts w:ascii="Arial" w:eastAsia="Times New Roman" w:hAnsi="Arial" w:cs="Arial"/>
-          <w:i/>
-          <w:iCs/>
-          <w:color w:val="000000"/>
-          <w:kern w:val="0"/>
-          <w:lang w:eastAsia="de-DE"/>
-          <w14:ligatures w14:val="none"/>
-        </w:rPr>
-        <w:t xml:space="preserve">, </w:t>
-      </w:r>
-      <w:proofErr w:type="spellStart"/>
-      <w:r>
-        <w:rPr>
-          <w:rFonts w:ascii="Arial" w:eastAsia="Times New Roman" w:hAnsi="Arial" w:cs="Arial"/>
-          <w:i/>
-          <w:iCs/>
-          <w:color w:val="000000"/>
-          <w:kern w:val="0"/>
-          <w:lang w:eastAsia="de-DE"/>
-          <w14:ligatures w14:val="none"/>
-        </w:rPr>
-        <w:t>services</w:t>
-      </w:r>
-      <w:proofErr w:type="spellEnd"/>
-      <w:r>
-        <w:rPr>
-          <w:rFonts w:ascii="Arial" w:eastAsia="Times New Roman" w:hAnsi="Arial" w:cs="Arial"/>
-          <w:i/>
-          <w:iCs/>
-          <w:color w:val="000000"/>
-          <w:kern w:val="0"/>
-          <w:lang w:eastAsia="de-DE"/>
-          <w14:ligatures w14:val="none"/>
-        </w:rPr>
-        <w:t>."</w:t>
+        <w:t>src Ordner und den unterordnern: middleware, models, services."</w:t>
       </w:r>
     </w:p>
     <w:p>
@@ -2278,85 +1688,7 @@
           <w:lang w:eastAsia="de-DE"/>
           <w14:ligatures w14:val="none"/>
         </w:rPr>
-        <w:t xml:space="preserve"> die </w:t>
-      </w:r>
-      <w:proofErr w:type="spellStart"/>
-      <w:r>
-        <w:rPr>
-          <w:rFonts w:ascii="Arial" w:eastAsia="Times New Roman" w:hAnsi="Arial" w:cs="Arial"/>
-          <w:i/>
-          <w:iCs/>
-          <w:color w:val="000000"/>
-          <w:kern w:val="0"/>
-          <w:lang w:eastAsia="de-DE"/>
-          <w14:ligatures w14:val="none"/>
-        </w:rPr>
-        <w:t>flutter</w:t>
-      </w:r>
-      <w:proofErr w:type="spellEnd"/>
-      <w:r>
-        <w:rPr>
-          <w:rFonts w:ascii="Arial" w:eastAsia="Times New Roman" w:hAnsi="Arial" w:cs="Arial"/>
-          <w:i/>
-          <w:iCs/>
-          <w:color w:val="000000"/>
-          <w:kern w:val="0"/>
-          <w:lang w:eastAsia="de-DE"/>
-          <w14:ligatures w14:val="none"/>
-        </w:rPr>
-        <w:t xml:space="preserve"> </w:t>
-      </w:r>
-      <w:proofErr w:type="spellStart"/>
-      <w:r>
-        <w:rPr>
-          <w:rFonts w:ascii="Arial" w:eastAsia="Times New Roman" w:hAnsi="Arial" w:cs="Arial"/>
-          <w:i/>
-          <w:iCs/>
-          <w:color w:val="000000"/>
-          <w:kern w:val="0"/>
-          <w:lang w:eastAsia="de-DE"/>
-          <w14:ligatures w14:val="none"/>
-        </w:rPr>
-        <w:t>app</w:t>
-      </w:r>
-      <w:proofErr w:type="spellEnd"/>
-      <w:r>
-        <w:rPr>
-          <w:rFonts w:ascii="Arial" w:eastAsia="Times New Roman" w:hAnsi="Arial" w:cs="Arial"/>
-          <w:i/>
-          <w:iCs/>
-          <w:color w:val="000000"/>
-          <w:kern w:val="0"/>
-          <w:lang w:eastAsia="de-DE"/>
-          <w14:ligatures w14:val="none"/>
-        </w:rPr>
-        <w:t xml:space="preserve"> zu diesem backend: sie soll gut strukturiert sein und alle Features des </w:t>
-      </w:r>
-      <w:proofErr w:type="spellStart"/>
-      <w:r>
-        <w:rPr>
-          <w:rFonts w:ascii="Arial" w:eastAsia="Times New Roman" w:hAnsi="Arial" w:cs="Arial"/>
-          <w:i/>
-          <w:iCs/>
-          <w:color w:val="000000"/>
-          <w:kern w:val="0"/>
-          <w:lang w:eastAsia="de-DE"/>
-          <w14:ligatures w14:val="none"/>
-        </w:rPr>
-        <w:t>backends</w:t>
-      </w:r>
-      <w:proofErr w:type="spellEnd"/>
-      <w:r>
-        <w:rPr>
-          <w:rFonts w:ascii="Arial" w:eastAsia="Times New Roman" w:hAnsi="Arial" w:cs="Arial"/>
-          <w:i/>
-          <w:iCs/>
-          <w:color w:val="000000"/>
-          <w:kern w:val="0"/>
-          <w:lang w:eastAsia="de-DE"/>
-          <w14:ligatures w14:val="none"/>
-        </w:rPr>
-        <w:t xml:space="preserve"> verwenden</w:t>
+        <w:t xml:space="preserve"> die flutter app zu diesem backend: sie soll gut strukturiert sein und alle Features des backends verwenden</w:t>
       </w:r>
       <w:r>
         <w:rPr>
@@ -2440,281 +1772,1008 @@
         </w:rPr>
         <w:t xml:space="preserve"> </w:t>
       </w:r>
-      <w:proofErr w:type="spellStart"/>
-      <w:r>
-        <w:rPr>
-          <w:rFonts w:ascii="Arial" w:eastAsia="Times New Roman" w:hAnsi="Arial" w:cs="Arial"/>
-          <w:color w:val="000000"/>
-          <w:kern w:val="0"/>
-          <w:lang w:eastAsia="de-DE"/>
-          <w14:ligatures w14:val="none"/>
-        </w:rPr>
-        <w:t>lib</w:t>
-      </w:r>
-      <w:proofErr w:type="spellEnd"/>
-      <w:r>
-        <w:rPr>
-          <w:rFonts w:ascii="Arial" w:eastAsia="Times New Roman" w:hAnsi="Arial" w:cs="Arial"/>
-          <w:color w:val="000000"/>
-          <w:kern w:val="0"/>
-          <w:lang w:eastAsia="de-DE"/>
-          <w14:ligatures w14:val="none"/>
-        </w:rPr>
-        <w:t>/-Struktur (</w:t>
-      </w:r>
-      <w:proofErr w:type="spellStart"/>
-      <w:r>
-        <w:rPr>
-          <w:rFonts w:ascii="Arial" w:eastAsia="Times New Roman" w:hAnsi="Arial" w:cs="Arial"/>
-          <w:color w:val="000000"/>
-          <w:kern w:val="0"/>
-          <w:lang w:eastAsia="de-DE"/>
-          <w14:ligatures w14:val="none"/>
-        </w:rPr>
-        <w:t>core</w:t>
-      </w:r>
-      <w:proofErr w:type="spellEnd"/>
-      <w:r>
-        <w:rPr>
-          <w:rFonts w:ascii="Arial" w:eastAsia="Times New Roman" w:hAnsi="Arial" w:cs="Arial"/>
-          <w:color w:val="000000"/>
-          <w:kern w:val="0"/>
-          <w:lang w:eastAsia="de-DE"/>
-          <w14:ligatures w14:val="none"/>
+      <w:r>
+        <w:rPr>
+          <w:rFonts w:ascii="Arial" w:eastAsia="Times New Roman" w:hAnsi="Arial" w:cs="Arial"/>
+          <w:color w:val="000000"/>
+          <w:kern w:val="0"/>
+          <w:lang w:eastAsia="de-DE"/>
+          <w14:ligatures w14:val="none"/>
+        </w:rPr>
+        <w:t>lib/-Struktur (core,</w:t>
+      </w:r>
+      <w:r>
+        <w:rPr>
+          <w:rFonts w:ascii="Arial" w:eastAsia="Times New Roman" w:hAnsi="Arial" w:cs="Arial"/>
+          <w:color w:val="000000"/>
+          <w:kern w:val="0"/>
+          <w:lang w:eastAsia="de-DE"/>
+          <w14:ligatures w14:val="none"/>
+        </w:rPr>
+        <w:t xml:space="preserve"> </w:t>
+      </w:r>
+      <w:r>
+        <w:rPr>
+          <w:rFonts w:ascii="Arial" w:eastAsia="Times New Roman" w:hAnsi="Arial" w:cs="Arial"/>
+          <w:color w:val="000000"/>
+          <w:kern w:val="0"/>
+          <w:lang w:eastAsia="de-DE"/>
+          <w14:ligatures w14:val="none"/>
+        </w:rPr>
+        <w:t>models,</w:t>
+      </w:r>
+      <w:r>
+        <w:rPr>
+          <w:rFonts w:ascii="Arial" w:eastAsia="Times New Roman" w:hAnsi="Arial" w:cs="Arial"/>
+          <w:color w:val="000000"/>
+          <w:kern w:val="0"/>
+          <w:lang w:eastAsia="de-DE"/>
+          <w14:ligatures w14:val="none"/>
+        </w:rPr>
+        <w:t xml:space="preserve"> </w:t>
+      </w:r>
+      <w:r>
+        <w:rPr>
+          <w:rFonts w:ascii="Arial" w:eastAsia="Times New Roman" w:hAnsi="Arial" w:cs="Arial"/>
+          <w:color w:val="000000"/>
+          <w:kern w:val="0"/>
+          <w:lang w:eastAsia="de-DE"/>
+          <w14:ligatures w14:val="none"/>
+        </w:rPr>
+        <w:t>services,</w:t>
+      </w:r>
+      <w:r>
+        <w:rPr>
+          <w:rFonts w:ascii="Arial" w:eastAsia="Times New Roman" w:hAnsi="Arial" w:cs="Arial"/>
+          <w:color w:val="000000"/>
+          <w:kern w:val="0"/>
+          <w:lang w:eastAsia="de-DE"/>
+          <w14:ligatures w14:val="none"/>
+        </w:rPr>
+        <w:t xml:space="preserve"> </w:t>
+      </w:r>
+      <w:r>
+        <w:rPr>
+          <w:rFonts w:ascii="Arial" w:eastAsia="Times New Roman" w:hAnsi="Arial" w:cs="Arial"/>
+          <w:color w:val="000000"/>
+          <w:kern w:val="0"/>
+          <w:lang w:eastAsia="de-DE"/>
+          <w14:ligatures w14:val="none"/>
+        </w:rPr>
+        <w:t>screens), Einbindung von</w:t>
+      </w:r>
+      <w:r>
+        <w:rPr>
+          <w:rFonts w:ascii="Arial" w:eastAsia="Times New Roman" w:hAnsi="Arial" w:cs="Arial"/>
+          <w:color w:val="000000"/>
+          <w:kern w:val="0"/>
+          <w:lang w:eastAsia="de-DE"/>
+          <w14:ligatures w14:val="none"/>
+        </w:rPr>
+        <w:t xml:space="preserve"> </w:t>
+      </w:r>
+      <w:r>
+        <w:rPr>
+          <w:rFonts w:ascii="Arial" w:eastAsia="Times New Roman" w:hAnsi="Arial" w:cs="Arial"/>
+          <w:color w:val="000000"/>
+          <w:kern w:val="0"/>
+          <w:lang w:eastAsia="de-DE"/>
+          <w14:ligatures w14:val="none"/>
+        </w:rPr>
+        <w:t>http</w:t>
+      </w:r>
+      <w:r>
+        <w:rPr>
+          <w:rFonts w:ascii="Arial" w:eastAsia="Times New Roman" w:hAnsi="Arial" w:cs="Arial"/>
+          <w:color w:val="000000"/>
+          <w:kern w:val="0"/>
+          <w:lang w:eastAsia="de-DE"/>
+          <w14:ligatures w14:val="none"/>
+        </w:rPr>
+        <w:t xml:space="preserve"> </w:t>
+      </w:r>
+      <w:r>
+        <w:rPr>
+          <w:rFonts w:ascii="Arial" w:eastAsia="Times New Roman" w:hAnsi="Arial" w:cs="Arial"/>
+          <w:color w:val="000000"/>
+          <w:kern w:val="0"/>
+          <w:lang w:eastAsia="de-DE"/>
+          <w14:ligatures w14:val="none"/>
+        </w:rPr>
+        <w:t>und</w:t>
+      </w:r>
+      <w:r>
+        <w:rPr>
+          <w:rFonts w:ascii="Arial" w:eastAsia="Times New Roman" w:hAnsi="Arial" w:cs="Arial"/>
+          <w:color w:val="000000"/>
+          <w:kern w:val="0"/>
+          <w:lang w:eastAsia="de-DE"/>
+          <w14:ligatures w14:val="none"/>
+        </w:rPr>
+        <w:t xml:space="preserve"> </w:t>
+      </w:r>
+      <w:r>
+        <w:rPr>
+          <w:rFonts w:ascii="Arial" w:eastAsia="Times New Roman" w:hAnsi="Arial" w:cs="Arial"/>
+          <w:color w:val="000000"/>
+          <w:kern w:val="0"/>
+          <w:lang w:eastAsia="de-DE"/>
+          <w14:ligatures w14:val="none"/>
+        </w:rPr>
+        <w:t>fl_chart, sowie die automatische Generierung exakt passender Dart-Datenklassen (Exercise,</w:t>
+      </w:r>
+      <w:r>
+        <w:rPr>
+          <w:rFonts w:ascii="Arial" w:eastAsia="Times New Roman" w:hAnsi="Arial" w:cs="Arial"/>
+          <w:color w:val="000000"/>
+          <w:kern w:val="0"/>
+          <w:lang w:eastAsia="de-DE"/>
+          <w14:ligatures w14:val="none"/>
+        </w:rPr>
+        <w:t xml:space="preserve"> </w:t>
+      </w:r>
+      <w:r>
+        <w:rPr>
+          <w:rFonts w:ascii="Arial" w:eastAsia="Times New Roman" w:hAnsi="Arial" w:cs="Arial"/>
+          <w:color w:val="000000"/>
+          <w:kern w:val="0"/>
+          <w:lang w:eastAsia="de-DE"/>
+          <w14:ligatures w14:val="none"/>
+        </w:rPr>
+        <w:t>Workout, etc.) für das JSON-Parsing.</w:t>
+      </w:r>
+    </w:p>
+    <w:p/>
+    <w:p/>
+    <w:p/>
+    <w:p/>
+    <w:p/>
+    <w:p/>
+    <w:p>
+      <w:pPr>
+        <w:pStyle w:val="StandardWeb"/>
+        <w:spacing w:before="0" w:beforeAutospacing="0"/>
+        <w:rPr>
+          <w:rFonts w:ascii="Arial" w:hAnsi="Arial" w:cs="Arial"/>
+          <w:color w:val="000000"/>
+        </w:rPr>
+      </w:pPr>
+      <w:r>
+        <w:rPr>
+          <w:rFonts w:ascii="Arial" w:hAnsi="Arial" w:cs="Arial"/>
+          <w:color w:val="000000"/>
+        </w:rPr>
+        <w:t>Hier ist die Fortsetzung für dein Dokument</w:t>
+      </w:r>
+      <w:r>
+        <w:rPr>
+          <w:rStyle w:val="apple-converted-space"/>
+          <w:rFonts w:ascii="Arial" w:eastAsiaTheme="majorEastAsia" w:hAnsi="Arial" w:cs="Arial"/>
+          <w:color w:val="000000"/>
+        </w:rPr>
+        <w:t> </w:t>
+      </w:r>
+      <w:r>
+        <w:rPr>
+          <w:rFonts w:ascii="Arial" w:hAnsi="Arial" w:cs="Arial"/>
+          <w:b/>
+          <w:bCs/>
+          <w:color w:val="000000"/>
+        </w:rPr>
+        <w:t>„KI-Einsatz &amp; Prompt-Dokumentation“</w:t>
+      </w:r>
+      <w:r>
+        <w:rPr>
+          <w:rFonts w:ascii="Arial" w:hAnsi="Arial" w:cs="Arial"/>
+          <w:color w:val="000000"/>
+        </w:rPr>
+        <w:t>, die exakt dort ansetzt, wo dein bisheriger Stand aufhört (nach Phase 5):</w:t>
+      </w:r>
+    </w:p>
+    <w:p>
+      <w:pPr>
+        <w:pStyle w:val="StandardWeb"/>
+        <w:spacing w:before="0" w:beforeAutospacing="0"/>
+        <w:rPr>
+          <w:rFonts w:ascii="Arial" w:hAnsi="Arial" w:cs="Arial"/>
+          <w:color w:val="000000"/>
+        </w:rPr>
+      </w:pPr>
+      <w:r>
+        <w:rPr>
+          <w:rFonts w:ascii="Arial" w:hAnsi="Arial" w:cs="Arial"/>
+          <w:b/>
+          <w:bCs/>
+          <w:color w:val="000000"/>
+        </w:rPr>
+        <w:t>Phase 6: UI-Redesign (Hevy-Stil &amp; Logger-Logik)</w:t>
+      </w:r>
+    </w:p>
+    <w:p>
+      <w:pPr>
+        <w:pStyle w:val="StandardWeb"/>
+        <w:spacing w:before="0" w:beforeAutospacing="0"/>
+        <w:rPr>
+          <w:rFonts w:ascii="Arial" w:hAnsi="Arial" w:cs="Arial"/>
+          <w:color w:val="000000"/>
+        </w:rPr>
+      </w:pPr>
+      <w:r>
+        <w:rPr>
+          <w:rFonts w:ascii="Arial" w:hAnsi="Arial" w:cs="Arial"/>
+          <w:b/>
+          <w:bCs/>
+          <w:color w:val="000000"/>
+        </w:rPr>
+        <w:t>Ziel:</w:t>
+      </w:r>
+      <w:r>
+        <w:rPr>
+          <w:rStyle w:val="apple-converted-space"/>
+          <w:rFonts w:ascii="Arial" w:eastAsiaTheme="majorEastAsia" w:hAnsi="Arial" w:cs="Arial"/>
+          <w:color w:val="000000"/>
+        </w:rPr>
+        <w:t> </w:t>
+      </w:r>
+      <w:r>
+        <w:rPr>
+          <w:rFonts w:ascii="Arial" w:hAnsi="Arial" w:cs="Arial"/>
+          <w:color w:val="000000"/>
+        </w:rPr>
+        <w:t>Umstellung des Workout-Loggers auf ein listenbasiertes System mit Fokus auf Usability.</w:t>
+      </w:r>
+    </w:p>
+    <w:p>
+      <w:pPr>
+        <w:pStyle w:val="StandardWeb"/>
+        <w:spacing w:before="0" w:beforeAutospacing="0"/>
+        <w:rPr>
+          <w:rFonts w:ascii="Arial" w:hAnsi="Arial" w:cs="Arial"/>
+          <w:color w:val="000000"/>
+        </w:rPr>
+      </w:pPr>
+      <w:r>
+        <w:rPr>
+          <w:rFonts w:ascii="Arial" w:hAnsi="Arial" w:cs="Arial"/>
+          <w:b/>
+          <w:bCs/>
+          <w:color w:val="000000"/>
+        </w:rPr>
+        <w:t>Prompt:</w:t>
+      </w:r>
+      <w:r>
+        <w:rPr>
+          <w:rStyle w:val="apple-converted-space"/>
+          <w:rFonts w:ascii="Arial" w:eastAsiaTheme="majorEastAsia" w:hAnsi="Arial" w:cs="Arial"/>
+          <w:color w:val="000000"/>
+        </w:rPr>
+        <w:t> </w:t>
+      </w:r>
+      <w:r>
+        <w:rPr>
+          <w:rFonts w:ascii="Arial" w:hAnsi="Arial" w:cs="Arial"/>
+          <w:color w:val="000000"/>
+        </w:rPr>
+        <w:t>„Mache es anders: Bei 'Workouts' orientiere dich an der App 'Heavy'. Es soll so ungefähr sein wie bei 'Heavy', mit einem Timer, der erst startet, wenn eine Übung hinzugefügt wurde, und einem Button 'Workout speichern'.“</w:t>
+      </w:r>
+    </w:p>
+    <w:p>
+      <w:pPr>
+        <w:pStyle w:val="StandardWeb"/>
+        <w:spacing w:before="0" w:beforeAutospacing="0"/>
+        <w:rPr>
+          <w:rFonts w:ascii="Arial" w:hAnsi="Arial" w:cs="Arial"/>
+          <w:color w:val="000000"/>
+        </w:rPr>
+      </w:pPr>
+      <w:r>
+        <w:rPr>
+          <w:rFonts w:ascii="Arial" w:hAnsi="Arial" w:cs="Arial"/>
+          <w:b/>
+          <w:bCs/>
+          <w:color w:val="000000"/>
+        </w:rPr>
+        <w:lastRenderedPageBreak/>
+        <w:t>Ergebnis:</w:t>
+      </w:r>
+      <w:r>
+        <w:rPr>
+          <w:rStyle w:val="apple-converted-space"/>
+          <w:rFonts w:ascii="Arial" w:eastAsiaTheme="majorEastAsia" w:hAnsi="Arial" w:cs="Arial"/>
+          <w:color w:val="000000"/>
+        </w:rPr>
+        <w:t> </w:t>
+      </w:r>
+      <w:r>
+        <w:rPr>
+          <w:rFonts w:ascii="Arial" w:hAnsi="Arial" w:cs="Arial"/>
+          <w:color w:val="000000"/>
+        </w:rPr>
+        <w:t>Ein dynamischer</w:t>
+      </w:r>
+      <w:r>
+        <w:rPr>
+          <w:rStyle w:val="apple-converted-space"/>
+          <w:rFonts w:ascii="Arial" w:eastAsiaTheme="majorEastAsia" w:hAnsi="Arial" w:cs="Arial"/>
+          <w:color w:val="000000"/>
+        </w:rPr>
+        <w:t> </w:t>
+      </w:r>
+      <w:r>
+        <w:rPr>
+          <w:rStyle w:val="HTMLCode"/>
+          <w:rFonts w:ascii="Arial" w:eastAsiaTheme="majorEastAsia" w:hAnsi="Arial" w:cs="Arial"/>
+          <w:color w:val="000000"/>
+        </w:rPr>
+        <w:t>WorkoutScreen</w:t>
+      </w:r>
+      <w:r>
+        <w:rPr>
+          <w:rFonts w:ascii="Arial" w:hAnsi="Arial" w:cs="Arial"/>
+          <w:color w:val="000000"/>
+        </w:rPr>
+        <w:t>, der Übungstracker-Objekte verwaltet. Er enthält eine integrierte Suchfunktion im Bottom-Sheet, Checkbox-Logik für abgeschlossene Sätze und eine zentralisierte Timer-Steuerung.</w:t>
+      </w:r>
+    </w:p>
+    <w:p>
+      <w:pPr>
+        <w:pStyle w:val="StandardWeb"/>
+        <w:spacing w:before="0" w:beforeAutospacing="0"/>
+        <w:rPr>
+          <w:rFonts w:ascii="Arial" w:hAnsi="Arial" w:cs="Arial"/>
+          <w:color w:val="000000"/>
+        </w:rPr>
+      </w:pPr>
+      <w:r>
+        <w:rPr>
+          <w:rFonts w:ascii="Arial" w:hAnsi="Arial" w:cs="Arial"/>
+          <w:b/>
+          <w:bCs/>
+          <w:color w:val="000000"/>
+        </w:rPr>
+        <w:t>Phase 7: Erweiterte Übungsdetails &amp; Backend-Anpassung</w:t>
+      </w:r>
+    </w:p>
+    <w:p>
+      <w:pPr>
+        <w:pStyle w:val="StandardWeb"/>
+        <w:spacing w:before="0" w:beforeAutospacing="0"/>
+        <w:rPr>
+          <w:rFonts w:ascii="Arial" w:hAnsi="Arial" w:cs="Arial"/>
+          <w:color w:val="000000"/>
+        </w:rPr>
+      </w:pPr>
+      <w:r>
+        <w:rPr>
+          <w:rFonts w:ascii="Arial" w:hAnsi="Arial" w:cs="Arial"/>
+          <w:b/>
+          <w:bCs/>
+          <w:color w:val="000000"/>
+        </w:rPr>
+        <w:t>Ziel:</w:t>
+      </w:r>
+      <w:r>
+        <w:rPr>
+          <w:rStyle w:val="apple-converted-space"/>
+          <w:rFonts w:ascii="Arial" w:eastAsiaTheme="majorEastAsia" w:hAnsi="Arial" w:cs="Arial"/>
+          <w:color w:val="000000"/>
+        </w:rPr>
+        <w:t> </w:t>
+      </w:r>
+      <w:r>
+        <w:rPr>
+          <w:rFonts w:ascii="Arial" w:hAnsi="Arial" w:cs="Arial"/>
+          <w:color w:val="000000"/>
+        </w:rPr>
+        <w:t>Integration von Fachwissen (Anleitungen) direkt in die App-Oberfläche.</w:t>
+      </w:r>
+    </w:p>
+    <w:p>
+      <w:pPr>
+        <w:pStyle w:val="StandardWeb"/>
+        <w:spacing w:before="0" w:beforeAutospacing="0"/>
+        <w:rPr>
+          <w:rFonts w:ascii="Arial" w:hAnsi="Arial" w:cs="Arial"/>
+          <w:color w:val="000000"/>
+        </w:rPr>
+      </w:pPr>
+      <w:r>
+        <w:rPr>
+          <w:rFonts w:ascii="Arial" w:hAnsi="Arial" w:cs="Arial"/>
+          <w:b/>
+          <w:bCs/>
+          <w:color w:val="000000"/>
+        </w:rPr>
+        <w:t>Prompt:</w:t>
+      </w:r>
+      <w:r>
+        <w:rPr>
+          <w:rStyle w:val="apple-converted-space"/>
+          <w:rFonts w:ascii="Arial" w:eastAsiaTheme="majorEastAsia" w:hAnsi="Arial" w:cs="Arial"/>
+          <w:color w:val="000000"/>
+        </w:rPr>
+        <w:t> </w:t>
+      </w:r>
+      <w:r>
+        <w:rPr>
+          <w:rFonts w:ascii="Arial" w:hAnsi="Arial" w:cs="Arial"/>
+          <w:color w:val="000000"/>
+        </w:rPr>
+        <w:t>„Mache, dass wenn ich auf eine Übung klicke, eine kleine Beschreibung bekomme, wie sie geht, auf was man achten muss und ein Bild der Ausführung. Sag mir, wie ich mein Backend dafür updaten muss.“</w:t>
+      </w:r>
+    </w:p>
+    <w:p>
+      <w:pPr>
+        <w:pStyle w:val="StandardWeb"/>
+        <w:spacing w:before="0" w:beforeAutospacing="0"/>
+        <w:rPr>
+          <w:rFonts w:ascii="Arial" w:hAnsi="Arial" w:cs="Arial"/>
+          <w:color w:val="000000"/>
+        </w:rPr>
+      </w:pPr>
+      <w:r>
+        <w:rPr>
+          <w:rFonts w:ascii="Arial" w:hAnsi="Arial" w:cs="Arial"/>
+          <w:b/>
+          <w:bCs/>
+          <w:color w:val="000000"/>
+        </w:rPr>
+        <w:t>Ergebnis:</w:t>
+      </w:r>
+      <w:r>
+        <w:rPr>
+          <w:rStyle w:val="apple-converted-space"/>
+          <w:rFonts w:ascii="Arial" w:eastAsiaTheme="majorEastAsia" w:hAnsi="Arial" w:cs="Arial"/>
+          <w:color w:val="000000"/>
+        </w:rPr>
+        <w:t> </w:t>
+      </w:r>
+      <w:r>
+        <w:rPr>
+          <w:rFonts w:ascii="Arial" w:hAnsi="Arial" w:cs="Arial"/>
+          <w:color w:val="000000"/>
+        </w:rPr>
+        <w:t>Erweiterung des SQLite-Schemas in</w:t>
+      </w:r>
+      <w:r>
+        <w:rPr>
+          <w:rStyle w:val="apple-converted-space"/>
+          <w:rFonts w:ascii="Arial" w:eastAsiaTheme="majorEastAsia" w:hAnsi="Arial" w:cs="Arial"/>
+          <w:color w:val="000000"/>
+        </w:rPr>
+        <w:t> </w:t>
+      </w:r>
+      <w:r>
+        <w:rPr>
+          <w:rStyle w:val="HTMLCode"/>
+          <w:rFonts w:ascii="Arial" w:eastAsiaTheme="majorEastAsia" w:hAnsi="Arial" w:cs="Arial"/>
+          <w:color w:val="000000"/>
+        </w:rPr>
+        <w:t>database.js</w:t>
+      </w:r>
+      <w:r>
+        <w:rPr>
+          <w:rStyle w:val="apple-converted-space"/>
+          <w:rFonts w:ascii="Arial" w:eastAsiaTheme="majorEastAsia" w:hAnsi="Arial" w:cs="Arial"/>
+          <w:color w:val="000000"/>
+        </w:rPr>
+        <w:t> </w:t>
+      </w:r>
+      <w:r>
+        <w:rPr>
+          <w:rFonts w:ascii="Arial" w:hAnsi="Arial" w:cs="Arial"/>
+          <w:color w:val="000000"/>
+        </w:rPr>
+        <w:t>um die Felder</w:t>
+      </w:r>
+      <w:r>
+        <w:rPr>
+          <w:rStyle w:val="apple-converted-space"/>
+          <w:rFonts w:ascii="Arial" w:eastAsiaTheme="majorEastAsia" w:hAnsi="Arial" w:cs="Arial"/>
+          <w:color w:val="000000"/>
+        </w:rPr>
+        <w:t> </w:t>
+      </w:r>
+      <w:r>
+        <w:rPr>
+          <w:rStyle w:val="HTMLCode"/>
+          <w:rFonts w:ascii="Arial" w:eastAsiaTheme="majorEastAsia" w:hAnsi="Arial" w:cs="Arial"/>
+          <w:color w:val="000000"/>
+        </w:rPr>
+        <w:t>description</w:t>
+      </w:r>
+      <w:r>
+        <w:rPr>
+          <w:rFonts w:ascii="Arial" w:hAnsi="Arial" w:cs="Arial"/>
+          <w:color w:val="000000"/>
         </w:rPr>
         <w:t>,</w:t>
       </w:r>
       <w:r>
         <w:rPr>
-          <w:rFonts w:ascii="Arial" w:eastAsia="Times New Roman" w:hAnsi="Arial" w:cs="Arial"/>
-          <w:color w:val="000000"/>
-          <w:kern w:val="0"/>
-          <w:lang w:eastAsia="de-DE"/>
-          <w14:ligatures w14:val="none"/>
-        </w:rPr>
-        <w:t xml:space="preserve"> </w:t>
-      </w:r>
-      <w:proofErr w:type="spellStart"/>
-      <w:r>
-        <w:rPr>
-          <w:rFonts w:ascii="Arial" w:eastAsia="Times New Roman" w:hAnsi="Arial" w:cs="Arial"/>
-          <w:color w:val="000000"/>
-          <w:kern w:val="0"/>
-          <w:lang w:eastAsia="de-DE"/>
-          <w14:ligatures w14:val="none"/>
-        </w:rPr>
-        <w:t>models</w:t>
-      </w:r>
-      <w:proofErr w:type="spellEnd"/>
-      <w:r>
-        <w:rPr>
-          <w:rFonts w:ascii="Arial" w:eastAsia="Times New Roman" w:hAnsi="Arial" w:cs="Arial"/>
-          <w:color w:val="000000"/>
-          <w:kern w:val="0"/>
-          <w:lang w:eastAsia="de-DE"/>
-          <w14:ligatures w14:val="none"/>
-        </w:rPr>
-        <w:t>,</w:t>
-      </w:r>
-      <w:r>
-        <w:rPr>
-          <w:rFonts w:ascii="Arial" w:eastAsia="Times New Roman" w:hAnsi="Arial" w:cs="Arial"/>
-          <w:color w:val="000000"/>
-          <w:kern w:val="0"/>
-          <w:lang w:eastAsia="de-DE"/>
-          <w14:ligatures w14:val="none"/>
-        </w:rPr>
-        <w:t xml:space="preserve"> </w:t>
-      </w:r>
-      <w:proofErr w:type="spellStart"/>
-      <w:r>
-        <w:rPr>
-          <w:rFonts w:ascii="Arial" w:eastAsia="Times New Roman" w:hAnsi="Arial" w:cs="Arial"/>
-          <w:color w:val="000000"/>
-          <w:kern w:val="0"/>
-          <w:lang w:eastAsia="de-DE"/>
-          <w14:ligatures w14:val="none"/>
-        </w:rPr>
-        <w:t>services</w:t>
-      </w:r>
-      <w:proofErr w:type="spellEnd"/>
-      <w:r>
-        <w:rPr>
-          <w:rFonts w:ascii="Arial" w:eastAsia="Times New Roman" w:hAnsi="Arial" w:cs="Arial"/>
-          <w:color w:val="000000"/>
-          <w:kern w:val="0"/>
-          <w:lang w:eastAsia="de-DE"/>
-          <w14:ligatures w14:val="none"/>
-        </w:rPr>
-        <w:t>,</w:t>
-      </w:r>
-      <w:r>
-        <w:rPr>
-          <w:rFonts w:ascii="Arial" w:eastAsia="Times New Roman" w:hAnsi="Arial" w:cs="Arial"/>
-          <w:color w:val="000000"/>
-          <w:kern w:val="0"/>
-          <w:lang w:eastAsia="de-DE"/>
-          <w14:ligatures w14:val="none"/>
-        </w:rPr>
-        <w:t xml:space="preserve"> </w:t>
-      </w:r>
-      <w:proofErr w:type="spellStart"/>
-      <w:r>
-        <w:rPr>
-          <w:rFonts w:ascii="Arial" w:eastAsia="Times New Roman" w:hAnsi="Arial" w:cs="Arial"/>
-          <w:color w:val="000000"/>
-          <w:kern w:val="0"/>
-          <w:lang w:eastAsia="de-DE"/>
-          <w14:ligatures w14:val="none"/>
-        </w:rPr>
-        <w:t>screens</w:t>
-      </w:r>
-      <w:proofErr w:type="spellEnd"/>
-      <w:r>
-        <w:rPr>
-          <w:rFonts w:ascii="Arial" w:eastAsia="Times New Roman" w:hAnsi="Arial" w:cs="Arial"/>
-          <w:color w:val="000000"/>
-          <w:kern w:val="0"/>
-          <w:lang w:eastAsia="de-DE"/>
-          <w14:ligatures w14:val="none"/>
-        </w:rPr>
-        <w:t>), Einbindung von</w:t>
-      </w:r>
-      <w:r>
-        <w:rPr>
-          <w:rFonts w:ascii="Arial" w:eastAsia="Times New Roman" w:hAnsi="Arial" w:cs="Arial"/>
-          <w:color w:val="000000"/>
-          <w:kern w:val="0"/>
-          <w:lang w:eastAsia="de-DE"/>
-          <w14:ligatures w14:val="none"/>
-        </w:rPr>
-        <w:t xml:space="preserve"> </w:t>
-      </w:r>
-      <w:r>
-        <w:rPr>
-          <w:rFonts w:ascii="Arial" w:eastAsia="Times New Roman" w:hAnsi="Arial" w:cs="Arial"/>
-          <w:color w:val="000000"/>
-          <w:kern w:val="0"/>
-          <w:lang w:eastAsia="de-DE"/>
-          <w14:ligatures w14:val="none"/>
-        </w:rPr>
-        <w:t>http</w:t>
-      </w:r>
-      <w:r>
-        <w:rPr>
-          <w:rFonts w:ascii="Arial" w:eastAsia="Times New Roman" w:hAnsi="Arial" w:cs="Arial"/>
-          <w:color w:val="000000"/>
-          <w:kern w:val="0"/>
-          <w:lang w:eastAsia="de-DE"/>
-          <w14:ligatures w14:val="none"/>
-        </w:rPr>
-        <w:t xml:space="preserve"> </w:t>
-      </w:r>
-      <w:r>
-        <w:rPr>
-          <w:rFonts w:ascii="Arial" w:eastAsia="Times New Roman" w:hAnsi="Arial" w:cs="Arial"/>
-          <w:color w:val="000000"/>
-          <w:kern w:val="0"/>
-          <w:lang w:eastAsia="de-DE"/>
-          <w14:ligatures w14:val="none"/>
+          <w:rStyle w:val="apple-converted-space"/>
+          <w:rFonts w:ascii="Arial" w:eastAsiaTheme="majorEastAsia" w:hAnsi="Arial" w:cs="Arial"/>
+          <w:color w:val="000000"/>
+        </w:rPr>
+        <w:t> </w:t>
+      </w:r>
+      <w:r>
+        <w:rPr>
+          <w:rStyle w:val="HTMLCode"/>
+          <w:rFonts w:ascii="Arial" w:eastAsiaTheme="majorEastAsia" w:hAnsi="Arial" w:cs="Arial"/>
+          <w:color w:val="000000"/>
+        </w:rPr>
+        <w:t>tips</w:t>
+      </w:r>
+      <w:r>
+        <w:rPr>
+          <w:rStyle w:val="apple-converted-space"/>
+          <w:rFonts w:ascii="Arial" w:eastAsiaTheme="majorEastAsia" w:hAnsi="Arial" w:cs="Arial"/>
+          <w:color w:val="000000"/>
+        </w:rPr>
+        <w:t> </w:t>
+      </w:r>
+      <w:r>
+        <w:rPr>
+          <w:rFonts w:ascii="Arial" w:hAnsi="Arial" w:cs="Arial"/>
+          <w:color w:val="000000"/>
         </w:rPr>
         <w:t>und</w:t>
       </w:r>
       <w:r>
         <w:rPr>
-          <w:rFonts w:ascii="Arial" w:eastAsia="Times New Roman" w:hAnsi="Arial" w:cs="Arial"/>
-          <w:color w:val="000000"/>
-          <w:kern w:val="0"/>
-          <w:lang w:eastAsia="de-DE"/>
-          <w14:ligatures w14:val="none"/>
-        </w:rPr>
-        <w:t xml:space="preserve"> </w:t>
-      </w:r>
-      <w:proofErr w:type="spellStart"/>
-      <w:r>
-        <w:rPr>
-          <w:rFonts w:ascii="Arial" w:eastAsia="Times New Roman" w:hAnsi="Arial" w:cs="Arial"/>
-          <w:color w:val="000000"/>
-          <w:kern w:val="0"/>
-          <w:lang w:eastAsia="de-DE"/>
-          <w14:ligatures w14:val="none"/>
+          <w:rStyle w:val="apple-converted-space"/>
+          <w:rFonts w:ascii="Arial" w:eastAsiaTheme="majorEastAsia" w:hAnsi="Arial" w:cs="Arial"/>
+          <w:color w:val="000000"/>
+        </w:rPr>
+        <w:t> </w:t>
+      </w:r>
+      <w:r>
+        <w:rPr>
+          <w:rStyle w:val="HTMLCode"/>
+          <w:rFonts w:ascii="Arial" w:eastAsiaTheme="majorEastAsia" w:hAnsi="Arial" w:cs="Arial"/>
+          <w:color w:val="000000"/>
+        </w:rPr>
+        <w:t>image_url</w:t>
+      </w:r>
+      <w:r>
+        <w:rPr>
+          <w:rFonts w:ascii="Arial" w:hAnsi="Arial" w:cs="Arial"/>
+          <w:color w:val="000000"/>
+        </w:rPr>
+        <w:t>. Implementierung einer Detail-Ansicht im</w:t>
+      </w:r>
+      <w:r>
+        <w:rPr>
+          <w:rStyle w:val="apple-converted-space"/>
+          <w:rFonts w:ascii="Arial" w:eastAsiaTheme="majorEastAsia" w:hAnsi="Arial" w:cs="Arial"/>
+          <w:color w:val="000000"/>
+        </w:rPr>
+        <w:t> </w:t>
+      </w:r>
+      <w:r>
+        <w:rPr>
+          <w:rStyle w:val="HTMLCode"/>
+          <w:rFonts w:ascii="Arial" w:eastAsiaTheme="majorEastAsia" w:hAnsi="Arial" w:cs="Arial"/>
+          <w:color w:val="000000"/>
+        </w:rPr>
+        <w:t>LibraryScreen</w:t>
+      </w:r>
+      <w:r>
+        <w:rPr>
+          <w:rFonts w:ascii="Arial" w:hAnsi="Arial" w:cs="Arial"/>
+          <w:color w:val="000000"/>
+        </w:rPr>
+        <w:t>, die diese Daten über ein interaktives Bottom-Sheet visualisiert.</w:t>
+      </w:r>
+    </w:p>
+    <w:p>
+      <w:pPr>
+        <w:pStyle w:val="StandardWeb"/>
+        <w:spacing w:before="0" w:beforeAutospacing="0"/>
+        <w:rPr>
+          <w:rFonts w:ascii="Arial" w:hAnsi="Arial" w:cs="Arial"/>
+          <w:color w:val="000000"/>
+        </w:rPr>
+      </w:pPr>
+      <w:r>
+        <w:rPr>
+          <w:rFonts w:ascii="Arial" w:hAnsi="Arial" w:cs="Arial"/>
+          <w:b/>
+          <w:bCs/>
+          <w:color w:val="000000"/>
+        </w:rPr>
+        <w:t>Phase 8: Datenvisualisierung &amp; Analyse (Progress)</w:t>
+      </w:r>
+    </w:p>
+    <w:p>
+      <w:pPr>
+        <w:pStyle w:val="StandardWeb"/>
+        <w:spacing w:before="0" w:beforeAutospacing="0"/>
+        <w:rPr>
+          <w:rFonts w:ascii="Arial" w:hAnsi="Arial" w:cs="Arial"/>
+          <w:color w:val="000000"/>
+        </w:rPr>
+      </w:pPr>
+      <w:r>
+        <w:rPr>
+          <w:rFonts w:ascii="Arial" w:hAnsi="Arial" w:cs="Arial"/>
+          <w:b/>
+          <w:bCs/>
+          <w:color w:val="000000"/>
+        </w:rPr>
+        <w:t>Ziel:</w:t>
+      </w:r>
+      <w:r>
+        <w:rPr>
+          <w:rStyle w:val="apple-converted-space"/>
+          <w:rFonts w:ascii="Arial" w:eastAsiaTheme="majorEastAsia" w:hAnsi="Arial" w:cs="Arial"/>
+          <w:color w:val="000000"/>
+        </w:rPr>
+        <w:t> </w:t>
+      </w:r>
+      <w:r>
+        <w:rPr>
+          <w:rFonts w:ascii="Arial" w:hAnsi="Arial" w:cs="Arial"/>
+          <w:color w:val="000000"/>
+        </w:rPr>
+        <w:t>Umfassende grafische Aufarbeitung der Trainingserfolge.</w:t>
+      </w:r>
+    </w:p>
+    <w:p>
+      <w:pPr>
+        <w:pStyle w:val="StandardWeb"/>
+        <w:spacing w:before="0" w:beforeAutospacing="0"/>
+        <w:rPr>
+          <w:rFonts w:ascii="Arial" w:hAnsi="Arial" w:cs="Arial"/>
+          <w:color w:val="000000"/>
+        </w:rPr>
+      </w:pPr>
+      <w:r>
+        <w:rPr>
+          <w:rFonts w:ascii="Arial" w:hAnsi="Arial" w:cs="Arial"/>
+          <w:b/>
+          <w:bCs/>
+          <w:color w:val="000000"/>
+        </w:rPr>
+        <w:t>Prompt:</w:t>
+      </w:r>
+      <w:r>
+        <w:rPr>
+          <w:rStyle w:val="apple-converted-space"/>
+          <w:rFonts w:ascii="Arial" w:eastAsiaTheme="majorEastAsia" w:hAnsi="Arial" w:cs="Arial"/>
+          <w:color w:val="000000"/>
+        </w:rPr>
+        <w:t> </w:t>
+      </w:r>
+      <w:r>
+        <w:rPr>
+          <w:rFonts w:ascii="Arial" w:hAnsi="Arial" w:cs="Arial"/>
+          <w:color w:val="000000"/>
+        </w:rPr>
+        <w:t>„Mache nun den Progress Screen. Orientiere dich wieder an 'Heavy' und benutze alle Features meines Backends, auch wenn es mehr Funktionen bietet als die Vorlage.“</w:t>
+      </w:r>
+    </w:p>
+    <w:p>
+      <w:pPr>
+        <w:pStyle w:val="StandardWeb"/>
+        <w:spacing w:before="0" w:beforeAutospacing="0"/>
+        <w:rPr>
+          <w:rFonts w:ascii="Arial" w:hAnsi="Arial" w:cs="Arial"/>
+          <w:color w:val="000000"/>
+        </w:rPr>
+      </w:pPr>
+      <w:r>
+        <w:rPr>
+          <w:rFonts w:ascii="Arial" w:hAnsi="Arial" w:cs="Arial"/>
+          <w:b/>
+          <w:bCs/>
+          <w:color w:val="000000"/>
+        </w:rPr>
+        <w:t>Ergebnis:</w:t>
+      </w:r>
+      <w:r>
+        <w:rPr>
+          <w:rStyle w:val="apple-converted-space"/>
+          <w:rFonts w:ascii="Arial" w:eastAsiaTheme="majorEastAsia" w:hAnsi="Arial" w:cs="Arial"/>
+          <w:color w:val="000000"/>
+        </w:rPr>
+        <w:t> </w:t>
+      </w:r>
+      <w:r>
+        <w:rPr>
+          <w:rFonts w:ascii="Arial" w:hAnsi="Arial" w:cs="Arial"/>
+          <w:color w:val="000000"/>
+        </w:rPr>
+        <w:t>Ein Statistik-Dashboard unter Nutzung von</w:t>
+      </w:r>
+      <w:r>
+        <w:rPr>
+          <w:rStyle w:val="apple-converted-space"/>
+          <w:rFonts w:ascii="Arial" w:eastAsiaTheme="majorEastAsia" w:hAnsi="Arial" w:cs="Arial"/>
+          <w:color w:val="000000"/>
+        </w:rPr>
+        <w:t> </w:t>
+      </w:r>
+      <w:r>
+        <w:rPr>
+          <w:rStyle w:val="HTMLCode"/>
+          <w:rFonts w:ascii="Arial" w:eastAsiaTheme="majorEastAsia" w:hAnsi="Arial" w:cs="Arial"/>
+          <w:color w:val="000000"/>
         </w:rPr>
         <w:t>fl_chart</w:t>
       </w:r>
-      <w:proofErr w:type="spellEnd"/>
-      <w:r>
-        <w:rPr>
-          <w:rFonts w:ascii="Arial" w:eastAsia="Times New Roman" w:hAnsi="Arial" w:cs="Arial"/>
-          <w:color w:val="000000"/>
-          <w:kern w:val="0"/>
-          <w:lang w:eastAsia="de-DE"/>
-          <w14:ligatures w14:val="none"/>
-        </w:rPr>
-        <w:t>, sowie die automatische Generierung exakt passender Dart-Datenklassen (</w:t>
-      </w:r>
-      <w:proofErr w:type="spellStart"/>
-      <w:r>
-        <w:rPr>
-          <w:rFonts w:ascii="Arial" w:eastAsia="Times New Roman" w:hAnsi="Arial" w:cs="Arial"/>
-          <w:color w:val="000000"/>
-          <w:kern w:val="0"/>
-          <w:lang w:eastAsia="de-DE"/>
-          <w14:ligatures w14:val="none"/>
-        </w:rPr>
-        <w:t>Exercise</w:t>
-      </w:r>
-      <w:proofErr w:type="spellEnd"/>
-      <w:r>
-        <w:rPr>
-          <w:rFonts w:ascii="Arial" w:eastAsia="Times New Roman" w:hAnsi="Arial" w:cs="Arial"/>
-          <w:color w:val="000000"/>
-          <w:kern w:val="0"/>
-          <w:lang w:eastAsia="de-DE"/>
-          <w14:ligatures w14:val="none"/>
-        </w:rPr>
-        <w:t>,</w:t>
-      </w:r>
-      <w:r>
-        <w:rPr>
-          <w:rFonts w:ascii="Arial" w:eastAsia="Times New Roman" w:hAnsi="Arial" w:cs="Arial"/>
-          <w:color w:val="000000"/>
-          <w:kern w:val="0"/>
-          <w:lang w:eastAsia="de-DE"/>
-          <w14:ligatures w14:val="none"/>
-        </w:rPr>
-        <w:t xml:space="preserve"> </w:t>
-      </w:r>
-      <w:r>
-        <w:rPr>
-          <w:rFonts w:ascii="Arial" w:eastAsia="Times New Roman" w:hAnsi="Arial" w:cs="Arial"/>
-          <w:color w:val="000000"/>
-          <w:kern w:val="0"/>
-          <w:lang w:eastAsia="de-DE"/>
-          <w14:ligatures w14:val="none"/>
-        </w:rPr>
-        <w:t>Workout, etc.) für das JSON-</w:t>
-      </w:r>
-      <w:proofErr w:type="spellStart"/>
-      <w:r>
-        <w:rPr>
-          <w:rFonts w:ascii="Arial" w:eastAsia="Times New Roman" w:hAnsi="Arial" w:cs="Arial"/>
-          <w:color w:val="000000"/>
-          <w:kern w:val="0"/>
-          <w:lang w:eastAsia="de-DE"/>
-          <w14:ligatures w14:val="none"/>
-        </w:rPr>
-        <w:t>Parsing</w:t>
-      </w:r>
-      <w:proofErr w:type="spellEnd"/>
-      <w:r>
-        <w:rPr>
-          <w:rFonts w:ascii="Arial" w:eastAsia="Times New Roman" w:hAnsi="Arial" w:cs="Arial"/>
-          <w:color w:val="000000"/>
-          <w:kern w:val="0"/>
-          <w:lang w:eastAsia="de-DE"/>
-          <w14:ligatures w14:val="none"/>
-        </w:rPr>
-        <w:t>.</w:t>
+      <w:r>
+        <w:rPr>
+          <w:rFonts w:ascii="Arial" w:hAnsi="Arial" w:cs="Arial"/>
+          <w:color w:val="000000"/>
+        </w:rPr>
+        <w:t>. Es verknüpft die Backend-Endpunkte für den Gewichtsverlauf (Line-Chart), die Muskelverteilung (Pie-Chart), Personal Records und das globale Ranking-System in einer übersichtlichen Ansicht.</w:t>
+      </w:r>
+    </w:p>
+    <w:p>
+      <w:pPr>
+        <w:pStyle w:val="StandardWeb"/>
+        <w:spacing w:before="0" w:beforeAutospacing="0"/>
+        <w:rPr>
+          <w:rFonts w:ascii="Arial" w:hAnsi="Arial" w:cs="Arial"/>
+          <w:color w:val="000000"/>
+        </w:rPr>
+      </w:pPr>
+      <w:r>
+        <w:rPr>
+          <w:rFonts w:ascii="Arial" w:hAnsi="Arial" w:cs="Arial"/>
+          <w:b/>
+          <w:bCs/>
+          <w:color w:val="000000"/>
+        </w:rPr>
+        <w:t>Phase 9: App-Einstellungen &amp; Finalisierung</w:t>
+      </w:r>
+    </w:p>
+    <w:p>
+      <w:pPr>
+        <w:pStyle w:val="StandardWeb"/>
+        <w:spacing w:before="0" w:beforeAutospacing="0"/>
+        <w:rPr>
+          <w:rFonts w:ascii="Arial" w:hAnsi="Arial" w:cs="Arial"/>
+          <w:color w:val="000000"/>
+        </w:rPr>
+      </w:pPr>
+      <w:r>
+        <w:rPr>
+          <w:rFonts w:ascii="Arial" w:hAnsi="Arial" w:cs="Arial"/>
+          <w:b/>
+          <w:bCs/>
+          <w:color w:val="000000"/>
+        </w:rPr>
+        <w:t>Ziel:</w:t>
+      </w:r>
+      <w:r>
+        <w:rPr>
+          <w:rStyle w:val="apple-converted-space"/>
+          <w:rFonts w:ascii="Arial" w:eastAsiaTheme="majorEastAsia" w:hAnsi="Arial" w:cs="Arial"/>
+          <w:color w:val="000000"/>
+        </w:rPr>
+        <w:t> </w:t>
+      </w:r>
+      <w:r>
+        <w:rPr>
+          <w:rFonts w:ascii="Arial" w:hAnsi="Arial" w:cs="Arial"/>
+          <w:color w:val="000000"/>
+        </w:rPr>
+        <w:t>Vervollständigung der Kern-Navigation und Nutzer-Präferenzen.</w:t>
+      </w:r>
+    </w:p>
+    <w:p>
+      <w:pPr>
+        <w:pStyle w:val="StandardWeb"/>
+        <w:spacing w:before="0" w:beforeAutospacing="0"/>
+        <w:rPr>
+          <w:rFonts w:ascii="Arial" w:hAnsi="Arial" w:cs="Arial"/>
+          <w:color w:val="000000"/>
+        </w:rPr>
+      </w:pPr>
+      <w:r>
+        <w:rPr>
+          <w:rFonts w:ascii="Arial" w:hAnsi="Arial" w:cs="Arial"/>
+          <w:b/>
+          <w:bCs/>
+          <w:color w:val="000000"/>
+        </w:rPr>
+        <w:t>Prompt:</w:t>
+      </w:r>
+      <w:r>
+        <w:rPr>
+          <w:rStyle w:val="apple-converted-space"/>
+          <w:rFonts w:ascii="Arial" w:eastAsiaTheme="majorEastAsia" w:hAnsi="Arial" w:cs="Arial"/>
+          <w:color w:val="000000"/>
+        </w:rPr>
+        <w:t> </w:t>
+      </w:r>
+      <w:r>
+        <w:rPr>
+          <w:rFonts w:ascii="Arial" w:hAnsi="Arial" w:cs="Arial"/>
+          <w:color w:val="000000"/>
+        </w:rPr>
+        <w:t>„Erstelle mir nun den Settings Screen mit Profil, Dunkelmodus-Option und Einheiten-Wechsel (kg/lbs).“</w:t>
+      </w:r>
+    </w:p>
+    <w:p>
+      <w:pPr>
+        <w:pStyle w:val="StandardWeb"/>
+        <w:spacing w:before="0" w:beforeAutospacing="0"/>
+        <w:rPr>
+          <w:rFonts w:ascii="Arial" w:hAnsi="Arial" w:cs="Arial"/>
+          <w:color w:val="000000"/>
+        </w:rPr>
+      </w:pPr>
+      <w:r>
+        <w:rPr>
+          <w:rFonts w:ascii="Arial" w:hAnsi="Arial" w:cs="Arial"/>
+          <w:b/>
+          <w:bCs/>
+          <w:color w:val="000000"/>
+        </w:rPr>
+        <w:t>Ergebnis:</w:t>
+      </w:r>
+      <w:r>
+        <w:rPr>
+          <w:rStyle w:val="apple-converted-space"/>
+          <w:rFonts w:ascii="Arial" w:eastAsiaTheme="majorEastAsia" w:hAnsi="Arial" w:cs="Arial"/>
+          <w:color w:val="000000"/>
+        </w:rPr>
+        <w:t> </w:t>
+      </w:r>
+      <w:r>
+        <w:rPr>
+          <w:rFonts w:ascii="Arial" w:hAnsi="Arial" w:cs="Arial"/>
+          <w:color w:val="000000"/>
+        </w:rPr>
+        <w:t>Erstellung des</w:t>
+      </w:r>
+      <w:r>
+        <w:rPr>
+          <w:rStyle w:val="apple-converted-space"/>
+          <w:rFonts w:ascii="Arial" w:eastAsiaTheme="majorEastAsia" w:hAnsi="Arial" w:cs="Arial"/>
+          <w:color w:val="000000"/>
+        </w:rPr>
+        <w:t> </w:t>
+      </w:r>
+      <w:r>
+        <w:rPr>
+          <w:rStyle w:val="HTMLCode"/>
+          <w:rFonts w:ascii="Arial" w:eastAsiaTheme="majorEastAsia" w:hAnsi="Arial" w:cs="Arial"/>
+          <w:color w:val="000000"/>
+        </w:rPr>
+        <w:t>SettingsScreen</w:t>
+      </w:r>
+      <w:r>
+        <w:rPr>
+          <w:rFonts w:ascii="Arial" w:hAnsi="Arial" w:cs="Arial"/>
+          <w:color w:val="000000"/>
+        </w:rPr>
+        <w:t>, der das visuelle Design der App abrundet und Platzhalter für die Account-Verwaltung sowie die Steuerung der App-Einheiten bietet.</w:t>
+      </w:r>
+    </w:p>
+    <w:p>
+      <w:pPr>
+        <w:pStyle w:val="StandardWeb"/>
+        <w:spacing w:before="0" w:beforeAutospacing="0"/>
+        <w:rPr>
+          <w:rFonts w:ascii="Arial" w:hAnsi="Arial" w:cs="Arial"/>
+          <w:color w:val="000000"/>
+        </w:rPr>
+      </w:pPr>
+      <w:r>
+        <w:rPr>
+          <w:rFonts w:ascii="Arial" w:hAnsi="Arial" w:cs="Arial"/>
+          <w:b/>
+          <w:bCs/>
+          <w:color w:val="000000"/>
+        </w:rPr>
+        <w:t>Phase 10: Lokalisierung &amp; UX-Feinschliff</w:t>
+      </w:r>
+    </w:p>
+    <w:p>
+      <w:pPr>
+        <w:pStyle w:val="StandardWeb"/>
+        <w:spacing w:before="0" w:beforeAutospacing="0"/>
+        <w:rPr>
+          <w:rFonts w:ascii="Arial" w:hAnsi="Arial" w:cs="Arial"/>
+          <w:color w:val="000000"/>
+        </w:rPr>
+      </w:pPr>
+      <w:r>
+        <w:rPr>
+          <w:rFonts w:ascii="Arial" w:hAnsi="Arial" w:cs="Arial"/>
+          <w:b/>
+          <w:bCs/>
+          <w:color w:val="000000"/>
+        </w:rPr>
+        <w:t>Ziel:</w:t>
+      </w:r>
+      <w:r>
+        <w:rPr>
+          <w:rStyle w:val="apple-converted-space"/>
+          <w:rFonts w:ascii="Arial" w:eastAsiaTheme="majorEastAsia" w:hAnsi="Arial" w:cs="Arial"/>
+          <w:color w:val="000000"/>
+        </w:rPr>
+        <w:t> </w:t>
+      </w:r>
+      <w:r>
+        <w:rPr>
+          <w:rFonts w:ascii="Arial" w:hAnsi="Arial" w:cs="Arial"/>
+          <w:color w:val="000000"/>
+        </w:rPr>
+        <w:t>Optimierung der Nutzererfahrung für den deutschsprachigen Raum.</w:t>
+      </w:r>
+    </w:p>
+    <w:p>
+      <w:pPr>
+        <w:pStyle w:val="StandardWeb"/>
+        <w:spacing w:before="0" w:beforeAutospacing="0"/>
+        <w:rPr>
+          <w:rFonts w:ascii="Arial" w:hAnsi="Arial" w:cs="Arial"/>
+          <w:color w:val="000000"/>
+        </w:rPr>
+      </w:pPr>
+      <w:r>
+        <w:rPr>
+          <w:rFonts w:ascii="Arial" w:hAnsi="Arial" w:cs="Arial"/>
+          <w:b/>
+          <w:bCs/>
+          <w:color w:val="000000"/>
+        </w:rPr>
+        <w:t>Prompt:</w:t>
+      </w:r>
+      <w:r>
+        <w:rPr>
+          <w:rStyle w:val="apple-converted-space"/>
+          <w:rFonts w:ascii="Arial" w:eastAsiaTheme="majorEastAsia" w:hAnsi="Arial" w:cs="Arial"/>
+          <w:color w:val="000000"/>
+        </w:rPr>
+        <w:t> </w:t>
+      </w:r>
+      <w:r>
+        <w:rPr>
+          <w:rFonts w:ascii="Arial" w:hAnsi="Arial" w:cs="Arial"/>
+          <w:color w:val="000000"/>
+        </w:rPr>
+        <w:t>„Stelle den Text vom ganzen Screen auf Deutsch um und füge im 'Select Exercise' Fenster eine Suchleiste hinzu.“</w:t>
+      </w:r>
+    </w:p>
+    <w:p>
+      <w:pPr>
+        <w:pStyle w:val="StandardWeb"/>
+        <w:spacing w:before="0" w:beforeAutospacing="0"/>
+        <w:rPr>
+          <w:rFonts w:ascii="Arial" w:hAnsi="Arial" w:cs="Arial"/>
+          <w:color w:val="000000"/>
+        </w:rPr>
+      </w:pPr>
+      <w:r>
+        <w:rPr>
+          <w:rFonts w:ascii="Arial" w:hAnsi="Arial" w:cs="Arial"/>
+          <w:b/>
+          <w:bCs/>
+          <w:color w:val="000000"/>
+        </w:rPr>
+        <w:t>Ergebnis:</w:t>
+      </w:r>
+      <w:r>
+        <w:rPr>
+          <w:rStyle w:val="apple-converted-space"/>
+          <w:rFonts w:ascii="Arial" w:eastAsiaTheme="majorEastAsia" w:hAnsi="Arial" w:cs="Arial"/>
+          <w:color w:val="000000"/>
+        </w:rPr>
+        <w:t> </w:t>
+      </w:r>
+      <w:r>
+        <w:rPr>
+          <w:rFonts w:ascii="Arial" w:hAnsi="Arial" w:cs="Arial"/>
+          <w:color w:val="000000"/>
+        </w:rPr>
+        <w:t>Vollständige Lokalisierung aller UI-Komponenten und Implementierung einer Echtzeit-Filterung (StatefulBuilder) innerhalb der Übungsauswahl zur schnelleren Navigation bei großen Datensätzen.</w:t>
       </w:r>
     </w:p>
     <w:p/>

</xml_diff>